<commit_message>
fixing some bugs and improving
</commit_message>
<xml_diff>
--- a/template.docx
+++ b/template.docx
@@ -370,9 +370,9 @@
                           <a:avLst/>
                           <a:gdLst>
                             <a:gd name="textAreaLeft" fmla="*/ 0 w 3481920"/>
-                            <a:gd name="textAreaRight" fmla="*/ 3488760 w 3481920"/>
+                            <a:gd name="textAreaRight" fmla="*/ 3489480 w 3481920"/>
                             <a:gd name="textAreaTop" fmla="*/ 0 h 720"/>
-                            <a:gd name="textAreaBottom" fmla="*/ 1294920 h 720"/>
+                            <a:gd name="textAreaBottom" fmla="*/ 2913120 h 720"/>
                           </a:gdLst>
                           <a:ahLst/>
                           <a:rect l="textAreaLeft" t="textAreaTop" r="textAreaRight" b="textAreaBottom"/>
@@ -3745,7 +3745,7 @@
       </w:r>
       <w:r>
         <w:rPr/>
-        <w:t>, organized by IdeaPad, the business Incubator of ITM Universe, was held on 20-04-2026 for a duration of 5 hours.</w:t>
+        <w:t>, organized by IdeaPad, the business Incubator of ITM Universe, was held on {{ date }} for a duration of {{ duration }}.</w:t>
       </w:r>
     </w:p>
     <w:p>
@@ -3791,7 +3791,7 @@
       </w:r>
       <w:r>
         <w:rPr/>
-        <w:t xml:space="preserve"> 72 students registered, 35 turned up on time, and 25 completed the hackathon.</w:t>
+        <w:t xml:space="preserve"> {{ register1 }} students registered, {{ register2 }} turned up on time, and {{ register3 }} completed the hackathon.</w:t>
       </w:r>
     </w:p>
     <w:p>
@@ -3903,7 +3903,7 @@
       </w:pPr>
       <w:r>
         <w:rPr/>
-        <w:t>Out of the 8 teams that took up problems, 2 teams qualified for Protofest, and their ideas were submitted to iDEX.</w:t>
+        <w:t>Out of the [ ] teams that took up problems, [ ] teams qualified for Protofest.</w:t>
       </w:r>
     </w:p>
     <w:p>
@@ -3942,11 +3942,11 @@
           <w:b/>
           <w:bCs/>
         </w:rPr>
-        <w:t>Team 2 (Y-NOT!):</w:t>
-      </w:r>
-      <w:r>
-        <w:rPr/>
-        <w:t xml:space="preserve"> Worked on "Hybrid Al (Quantum +AI)-Enhanced Standard GCS for UAS".</w:t>
+        <w:t>Team [no.] (name):</w:t>
+      </w:r>
+      <w:r>
+        <w:rPr/>
+        <w:t xml:space="preserve"> Worked on "".</w:t>
       </w:r>
     </w:p>
     <w:p>
@@ -3968,11 +3968,11 @@
           <w:b/>
           <w:bCs/>
         </w:rPr>
-        <w:t>Team 8 (RobyX):</w:t>
-      </w:r>
-      <w:r>
-        <w:rPr/>
-        <w:t xml:space="preserve"> Worked on "HUMANOID DECOY ROBOT SYSTEM".</w:t>
+        <w:t>Team [no] (name):</w:t>
+      </w:r>
+      <w:r>
+        <w:rPr/>
+        <w:t xml:space="preserve"> Worked on "".</w:t>
       </w:r>
     </w:p>
     <w:p>
@@ -3993,7 +3993,7 @@
       </w:r>
       <w:r>
         <w:rPr/>
-        <w:t xml:space="preserve"> Team 1 (Aegis Ai), Team 3 (Autobots), Team 5 (Fortis Defense), and Team 6 (Neural Soldier).</w:t>
+        <w:t xml:space="preserve"> Team [no] (name)</w:t>
       </w:r>
     </w:p>
     <w:p>
@@ -4014,7 +4014,7 @@
       </w:r>
       <w:r>
         <w:rPr/>
-        <w:t>Team 4 (Moticoor Laddu) and Team 7 (The Elite Solver) did not complete their submissions.</w:t>
+        <w:t>Team [no] (name) did not complete their submissions.</w:t>
       </w:r>
     </w:p>
     <w:p>

</xml_diff>

<commit_message>
adding disabling of the button
</commit_message>
<xml_diff>
--- a/template.docx
+++ b/template.docx
@@ -265,7 +265,7 @@
         <w:pStyle w:val="Normal"/>
         <w:widowControl w:val="false"/>
         <w:suppressAutoHyphens w:val="true"/>
-        <w:overflowPunct w:val="true"/>
+        <w:overflowPunct w:val="false"/>
         <w:bidi w:val="0"/>
         <w:spacing w:lineRule="auto" w:line="72" w:before="0" w:after="0"/>
         <w:ind w:hanging="0" w:start="340" w:end="-340"/>
@@ -370,9 +370,9 @@
                           <a:avLst/>
                           <a:gdLst>
                             <a:gd name="textAreaLeft" fmla="*/ 0 w 3481920"/>
-                            <a:gd name="textAreaRight" fmla="*/ 3489480 w 3481920"/>
+                            <a:gd name="textAreaRight" fmla="*/ 3489840 w 3481920"/>
                             <a:gd name="textAreaTop" fmla="*/ 0 h 720"/>
-                            <a:gd name="textAreaBottom" fmla="*/ 2913120 h 720"/>
+                            <a:gd name="textAreaBottom" fmla="*/ 4369680 h 720"/>
                           </a:gdLst>
                           <a:ahLst/>
                           <a:rect l="textAreaLeft" t="textAreaTop" r="textAreaRight" b="textAreaBottom"/>
@@ -3808,6 +3808,31 @@
           <w:b/>
           <w:bCs/>
         </w:rPr>
+        <w:t>Hackthon Detials:</w:t>
+      </w:r>
+    </w:p>
+    <w:p>
+      <w:pPr>
+        <w:pStyle w:val="Normal"/>
+        <w:numPr>
+          <w:ilvl w:val="0"/>
+          <w:numId w:val="0"/>
+        </w:numPr>
+        <w:ind w:hanging="0" w:start="720"/>
+        <w:rPr/>
+      </w:pPr>
+      <w:r>
+        <w:rPr>
+          <w:b/>
+          <w:bCs/>
+        </w:rPr>
+        <w:t xml:space="preserve">(example - </w:t>
+      </w:r>
+      <w:r>
+        <w:rPr>
+          <w:b/>
+          <w:bCs/>
+        </w:rPr>
         <w:t>iDEX:</w:t>
       </w:r>
       <w:r>
@@ -3869,6 +3894,10 @@
       <w:r>
         <w:rPr/>
         <w:t xml:space="preserve"> (early-stage concepts in military hardware).</w:t>
+      </w:r>
+      <w:r>
+        <w:rPr/>
+        <w:t>)</w:t>
       </w:r>
     </w:p>
     <w:p>
@@ -4501,7 +4530,7 @@
     <w:pPr>
       <w:widowControl w:val="false"/>
       <w:suppressAutoHyphens w:val="true"/>
-      <w:overflowPunct w:val="true"/>
+      <w:overflowPunct w:val="false"/>
       <w:bidi w:val="0"/>
       <w:spacing w:lineRule="auto" w:line="240" w:before="0" w:after="0"/>
       <w:jc w:val="start"/>

</xml_diff>

<commit_message>
fixing docx currupt bug
</commit_message>
<xml_diff>
--- a/template.docx
+++ b/template.docx
@@ -10,7 +10,7 @@
           <w:tab w:val="left" w:pos="3553" w:leader="none"/>
           <w:tab w:val="left" w:pos="7881" w:leader="none"/>
         </w:tabs>
-        <w:ind w:start="380"/>
+        <w:ind w:left="380"/>
         <w:jc w:val="center"/>
         <w:rPr>
           <w:rFonts w:ascii="Times New Roman" w:hAnsi="Times New Roman"/>
@@ -40,7 +40,7 @@
           <w:tab w:val="left" w:pos="3553" w:leader="none"/>
           <w:tab w:val="left" w:pos="7881" w:leader="none"/>
         </w:tabs>
-        <w:ind w:start="380"/>
+        <w:ind w:left="380"/>
         <w:jc w:val="center"/>
         <w:rPr>
           <w:rFonts w:ascii="Times New Roman" w:hAnsi="Times New Roman"/>
@@ -53,7 +53,7 @@
           <wp:inline distT="0" distB="0" distL="0" distR="0">
             <wp:extent cx="1028700" cy="542925"/>
             <wp:effectExtent l="0" t="0" r="0" b="0"/>
-            <wp:docPr id="1" name="Picture 1" descr="" title=""/>
+            <wp:docPr id="1" name="Picture 1" descr=""/>
             <wp:cNvGraphicFramePr>
               <a:graphicFrameLocks xmlns:a="http://schemas.openxmlformats.org/drawingml/2006/main" noChangeAspect="1"/>
             </wp:cNvGraphicFramePr>
@@ -61,7 +61,7 @@
               <a:graphicData uri="http://schemas.openxmlformats.org/drawingml/2006/picture">
                 <pic:pic xmlns:pic="http://schemas.openxmlformats.org/drawingml/2006/picture">
                   <pic:nvPicPr>
-                    <pic:cNvPr id="1" name="Picture 1" descr="" title=""/>
+                    <pic:cNvPr id="1" name="Picture 1" descr=""/>
                     <pic:cNvPicPr>
                       <a:picLocks noChangeAspect="1" noChangeArrowheads="1"/>
                     </pic:cNvPicPr>
@@ -97,7 +97,7 @@
           <wp:inline distT="0" distB="0" distL="0" distR="0">
             <wp:extent cx="1714500" cy="542925"/>
             <wp:effectExtent l="0" t="0" r="0" b="0"/>
-            <wp:docPr id="2" name="Picture 2" descr="" title=""/>
+            <wp:docPr id="2" name="Picture 2" descr=""/>
             <wp:cNvGraphicFramePr>
               <a:graphicFrameLocks xmlns:a="http://schemas.openxmlformats.org/drawingml/2006/main" noChangeAspect="1"/>
             </wp:cNvGraphicFramePr>
@@ -105,7 +105,7 @@
               <a:graphicData uri="http://schemas.openxmlformats.org/drawingml/2006/picture">
                 <pic:pic xmlns:pic="http://schemas.openxmlformats.org/drawingml/2006/picture">
                   <pic:nvPicPr>
-                    <pic:cNvPr id="2" name="Picture 2" descr="" title=""/>
+                    <pic:cNvPr id="2" name="Picture 2" descr=""/>
                     <pic:cNvPicPr>
                       <a:picLocks noChangeAspect="1" noChangeArrowheads="1"/>
                     </pic:cNvPicPr>
@@ -141,7 +141,7 @@
           <wp:inline distT="0" distB="0" distL="0" distR="0">
             <wp:extent cx="1224280" cy="543560"/>
             <wp:effectExtent l="0" t="0" r="0" b="0"/>
-            <wp:docPr id="3" name="Image 3" descr="" title=""/>
+            <wp:docPr id="3" name="Image 3" descr=""/>
             <wp:cNvGraphicFramePr>
               <a:graphicFrameLocks xmlns:a="http://schemas.openxmlformats.org/drawingml/2006/main" noChangeAspect="1"/>
             </wp:cNvGraphicFramePr>
@@ -149,7 +149,7 @@
               <a:graphicData uri="http://schemas.openxmlformats.org/drawingml/2006/picture">
                 <pic:pic xmlns:pic="http://schemas.openxmlformats.org/drawingml/2006/picture">
                   <pic:nvPicPr>
-                    <pic:cNvPr id="3" name="Image 3" descr="" title=""/>
+                    <pic:cNvPr id="3" name="Image 3" descr=""/>
                     <pic:cNvPicPr>
                       <a:picLocks noChangeAspect="1" noChangeArrowheads="1"/>
                     </pic:cNvPicPr>
@@ -188,7 +188,7 @@
           <w:tab w:val="left" w:pos="3553" w:leader="none"/>
           <w:tab w:val="left" w:pos="7881" w:leader="none"/>
         </w:tabs>
-        <w:ind w:start="380"/>
+        <w:ind w:left="380"/>
         <w:jc w:val="center"/>
         <w:rPr>
           <w:rFonts w:ascii="Times New Roman" w:hAnsi="Times New Roman"/>
@@ -210,7 +210,7 @@
           <w:tab w:val="left" w:pos="3553" w:leader="none"/>
           <w:tab w:val="left" w:pos="7881" w:leader="none"/>
         </w:tabs>
-        <w:ind w:start="380"/>
+        <w:ind w:left="380"/>
         <w:rPr>
           <w:rFonts w:ascii="Times New Roman" w:hAnsi="Times New Roman"/>
           <w:sz w:val="20"/>
@@ -268,8 +268,8 @@
         <w:overflowPunct w:val="false"/>
         <w:bidi w:val="0"/>
         <w:spacing w:lineRule="auto" w:line="72" w:before="0" w:after="0"/>
-        <w:ind w:hanging="0" w:start="340" w:end="-340"/>
-        <w:jc w:val="start"/>
+        <w:ind w:hanging="0" w:left="340" w:right="-340"/>
+        <w:jc w:val="left"/>
         <w:rPr>
           <w:rFonts w:ascii="Georgia" w:hAnsi="Georgia"/>
           <w:sz w:val="32"/>
@@ -370,9 +370,9 @@
                           <a:avLst/>
                           <a:gdLst>
                             <a:gd name="textAreaLeft" fmla="*/ 0 w 3481920"/>
-                            <a:gd name="textAreaRight" fmla="*/ 3489840 w 3481920"/>
+                            <a:gd name="textAreaRight" fmla="*/ 3490560 w 3481920"/>
                             <a:gd name="textAreaTop" fmla="*/ 0 h 720"/>
-                            <a:gd name="textAreaBottom" fmla="*/ 4369680 h 720"/>
+                            <a:gd name="textAreaBottom" fmla="*/ 9831600 h 720"/>
                           </a:gdLst>
                           <a:ahLst/>
                           <a:rect l="textAreaLeft" t="textAreaTop" r="textAreaRight" b="textAreaBottom"/>
@@ -418,7 +418,7 @@
       <w:pPr>
         <w:pStyle w:val="Normal"/>
         <w:spacing w:before="296" w:after="0"/>
-        <w:ind w:start="360"/>
+        <w:ind w:left="360"/>
         <w:rPr>
           <w:rFonts w:ascii="Georgia" w:hAnsi="Georgia"/>
           <w:b/>
@@ -495,7 +495,7 @@
                             <w:pPr>
                               <w:pStyle w:val="FrameContents"/>
                               <w:spacing w:before="5" w:after="0"/>
-                              <w:ind w:start="103"/>
+                              <w:ind w:left="103"/>
                               <w:rPr>
                                 <w:rFonts w:ascii="Georgia" w:hAnsi="Georgia"/>
                                 <w:sz w:val="20"/>
@@ -533,7 +533,7 @@
                       <w:pPr>
                         <w:pStyle w:val="FrameContents"/>
                         <w:spacing w:before="5" w:after="0"/>
-                        <w:ind w:start="103"/>
+                        <w:ind w:left="103"/>
                         <w:rPr>
                           <w:rFonts w:ascii="Georgia" w:hAnsi="Georgia"/>
                           <w:sz w:val="20"/>
@@ -571,7 +571,7 @@
     <w:p>
       <w:pPr>
         <w:pStyle w:val="BodyText"/>
-        <w:ind w:start="360"/>
+        <w:ind w:left="360"/>
         <w:rPr/>
       </w:pPr>
       <w:r>
@@ -599,7 +599,7 @@
     <w:p>
       <w:pPr>
         <w:pStyle w:val="BodyText"/>
-        <w:ind w:start="360"/>
+        <w:ind w:left="360"/>
         <w:rPr>
           <w:color w:val="7F7F7F"/>
           <w:spacing w:val="-2"/>
@@ -672,7 +672,7 @@
                             <w:pPr>
                               <w:pStyle w:val="FrameContents"/>
                               <w:spacing w:before="5" w:after="0"/>
-                              <w:ind w:start="103"/>
+                              <w:ind w:left="103"/>
                               <w:rPr>
                                 <w:rFonts w:ascii="Georgia" w:hAnsi="Georgia"/>
                                 <w:sz w:val="20"/>
@@ -709,7 +709,7 @@
                       <w:pPr>
                         <w:pStyle w:val="FrameContents"/>
                         <w:spacing w:before="5" w:after="0"/>
-                        <w:ind w:start="103"/>
+                        <w:ind w:left="103"/>
                         <w:rPr>
                           <w:rFonts w:ascii="Georgia" w:hAnsi="Georgia"/>
                           <w:sz w:val="20"/>
@@ -763,7 +763,7 @@
     <w:p>
       <w:pPr>
         <w:pStyle w:val="Normal"/>
-        <w:ind w:start="360"/>
+        <w:ind w:left="360"/>
         <w:rPr>
           <w:rFonts w:ascii="Georgia" w:hAnsi="Georgia"/>
           <w:b/>
@@ -886,14 +886,14 @@
     <w:tbl>
       <w:tblPr>
         <w:tblW w:w="9360" w:type="dxa"/>
-        <w:jc w:val="start"/>
+        <w:jc w:val="left"/>
         <w:tblInd w:w="365" w:type="dxa"/>
         <w:tblLayout w:type="fixed"/>
         <w:tblCellMar>
           <w:top w:w="0" w:type="dxa"/>
-          <w:start w:w="5" w:type="dxa"/>
+          <w:left w:w="5" w:type="dxa"/>
           <w:bottom w:w="0" w:type="dxa"/>
-          <w:end w:w="5" w:type="dxa"/>
+          <w:right w:w="5" w:type="dxa"/>
         </w:tblCellMar>
       </w:tblPr>
       <w:tblGrid>
@@ -910,9 +910,9 @@
             <w:tcW w:w="3120" w:type="dxa"/>
             <w:tcBorders>
               <w:top w:val="single" w:sz="4" w:space="0" w:color="000000"/>
-              <w:start w:val="single" w:sz="4" w:space="0" w:color="000000"/>
-              <w:bottom w:val="single" w:sz="4" w:space="0" w:color="000000"/>
-              <w:end w:val="single" w:sz="4" w:space="0" w:color="000000"/>
+              <w:left w:val="single" w:sz="4" w:space="0" w:color="000000"/>
+              <w:bottom w:val="single" w:sz="4" w:space="0" w:color="000000"/>
+              <w:right w:val="single" w:sz="4" w:space="0" w:color="000000"/>
             </w:tcBorders>
           </w:tcPr>
           <w:p>
@@ -992,16 +992,16 @@
             <w:tcW w:w="3110" w:type="dxa"/>
             <w:tcBorders>
               <w:top w:val="single" w:sz="4" w:space="0" w:color="000000"/>
-              <w:start w:val="single" w:sz="4" w:space="0" w:color="000000"/>
-              <w:bottom w:val="single" w:sz="4" w:space="0" w:color="000000"/>
-              <w:end w:val="single" w:sz="4" w:space="0" w:color="000000"/>
+              <w:left w:val="single" w:sz="4" w:space="0" w:color="000000"/>
+              <w:bottom w:val="single" w:sz="4" w:space="0" w:color="000000"/>
+              <w:right w:val="single" w:sz="4" w:space="0" w:color="000000"/>
             </w:tcBorders>
           </w:tcPr>
           <w:p>
             <w:pPr>
               <w:pStyle w:val="TableParagraph"/>
               <w:spacing w:lineRule="atLeast" w:line="220" w:before="0" w:after="0"/>
-              <w:ind w:start="108"/>
+              <w:ind w:left="108"/>
               <w:rPr>
                 <w:rFonts w:ascii="Georgia" w:hAnsi="Georgia"/>
                 <w:b/>
@@ -1091,16 +1091,16 @@
             <w:tcW w:w="3130" w:type="dxa"/>
             <w:tcBorders>
               <w:top w:val="single" w:sz="4" w:space="0" w:color="000000"/>
-              <w:start w:val="single" w:sz="4" w:space="0" w:color="000000"/>
-              <w:bottom w:val="single" w:sz="4" w:space="0" w:color="000000"/>
-              <w:end w:val="single" w:sz="4" w:space="0" w:color="000000"/>
+              <w:left w:val="single" w:sz="4" w:space="0" w:color="000000"/>
+              <w:bottom w:val="single" w:sz="4" w:space="0" w:color="000000"/>
+              <w:right w:val="single" w:sz="4" w:space="0" w:color="000000"/>
             </w:tcBorders>
           </w:tcPr>
           <w:p>
             <w:pPr>
               <w:pStyle w:val="TableParagraph"/>
               <w:spacing w:lineRule="atLeast" w:line="220" w:before="0" w:after="0"/>
-              <w:ind w:start="108" w:end="745"/>
+              <w:ind w:left="108" w:right="745"/>
               <w:rPr>
                 <w:rFonts w:ascii="Georgia" w:hAnsi="Georgia"/>
                 <w:b/>
@@ -1144,9 +1144,9 @@
             <w:tcW w:w="3120" w:type="dxa"/>
             <w:tcBorders>
               <w:top w:val="single" w:sz="4" w:space="0" w:color="000000"/>
-              <w:start w:val="single" w:sz="4" w:space="0" w:color="000000"/>
-              <w:bottom w:val="single" w:sz="4" w:space="0" w:color="000000"/>
-              <w:end w:val="single" w:sz="4" w:space="0" w:color="000000"/>
+              <w:left w:val="single" w:sz="4" w:space="0" w:color="000000"/>
+              <w:bottom w:val="single" w:sz="4" w:space="0" w:color="000000"/>
+              <w:right w:val="single" w:sz="4" w:space="0" w:color="000000"/>
             </w:tcBorders>
           </w:tcPr>
           <w:p>
@@ -1173,16 +1173,16 @@
             <w:tcW w:w="3110" w:type="dxa"/>
             <w:tcBorders>
               <w:top w:val="single" w:sz="4" w:space="0" w:color="000000"/>
-              <w:start w:val="single" w:sz="4" w:space="0" w:color="000000"/>
-              <w:bottom w:val="single" w:sz="4" w:space="0" w:color="000000"/>
-              <w:end w:val="single" w:sz="4" w:space="0" w:color="000000"/>
+              <w:left w:val="single" w:sz="4" w:space="0" w:color="000000"/>
+              <w:bottom w:val="single" w:sz="4" w:space="0" w:color="000000"/>
+              <w:right w:val="single" w:sz="4" w:space="0" w:color="000000"/>
             </w:tcBorders>
           </w:tcPr>
           <w:p>
             <w:pPr>
               <w:pStyle w:val="TableParagraph"/>
               <w:spacing w:lineRule="exact" w:line="202" w:before="5" w:after="0"/>
-              <w:ind w:start="108"/>
+              <w:ind w:left="108"/>
               <w:rPr>
                 <w:rFonts w:ascii="Georgia" w:hAnsi="Georgia"/>
                 <w:sz w:val="20"/>
@@ -1203,16 +1203,16 @@
             <w:tcW w:w="3130" w:type="dxa"/>
             <w:tcBorders>
               <w:top w:val="single" w:sz="4" w:space="0" w:color="000000"/>
-              <w:start w:val="single" w:sz="4" w:space="0" w:color="000000"/>
-              <w:bottom w:val="single" w:sz="4" w:space="0" w:color="000000"/>
-              <w:end w:val="single" w:sz="4" w:space="0" w:color="000000"/>
+              <w:left w:val="single" w:sz="4" w:space="0" w:color="000000"/>
+              <w:bottom w:val="single" w:sz="4" w:space="0" w:color="000000"/>
+              <w:right w:val="single" w:sz="4" w:space="0" w:color="000000"/>
             </w:tcBorders>
           </w:tcPr>
           <w:p>
             <w:pPr>
               <w:pStyle w:val="TableParagraph"/>
               <w:spacing w:lineRule="exact" w:line="202" w:before="5" w:after="0"/>
-              <w:ind w:start="108"/>
+              <w:ind w:left="108"/>
               <w:rPr>
                 <w:rFonts w:ascii="Georgia" w:hAnsi="Georgia"/>
                 <w:sz w:val="20"/>
@@ -1247,7 +1247,7 @@
       <w:pPr>
         <w:pStyle w:val="BodyText"/>
         <w:spacing w:before="80" w:after="0"/>
-        <w:ind w:start="360"/>
+        <w:ind w:left="360"/>
         <w:rPr/>
       </w:pPr>
       <w:r>
@@ -1365,7 +1365,7 @@
     <w:p>
       <w:pPr>
         <w:pStyle w:val="BodyText"/>
-        <w:ind w:start="360"/>
+        <w:ind w:left="360"/>
         <w:rPr>
           <w:b w:val="false"/>
           <w:bCs w:val="false"/>
@@ -1389,9 +1389,9 @@
         <w:tblLayout w:type="fixed"/>
         <w:tblCellMar>
           <w:top w:w="0" w:type="dxa"/>
-          <w:start w:w="5" w:type="dxa"/>
+          <w:left w:w="5" w:type="dxa"/>
           <w:bottom w:w="0" w:type="dxa"/>
-          <w:end w:w="5" w:type="dxa"/>
+          <w:right w:w="5" w:type="dxa"/>
         </w:tblCellMar>
       </w:tblPr>
       <w:tblGrid>
@@ -1412,7 +1412,7 @@
             <w:gridSpan w:val="2"/>
             <w:tcBorders>
               <w:top w:val="single" w:sz="4" w:space="0" w:color="000000"/>
-              <w:start w:val="single" w:sz="4" w:space="0" w:color="000000"/>
+              <w:left w:val="single" w:sz="4" w:space="0" w:color="000000"/>
               <w:bottom w:val="single" w:sz="4" w:space="0" w:color="000000"/>
             </w:tcBorders>
           </w:tcPr>
@@ -1460,7 +1460,7 @@
             <w:tcW w:w="1351" w:type="dxa"/>
             <w:tcBorders>
               <w:top w:val="single" w:sz="4" w:space="0" w:color="000000"/>
-              <w:start w:val="single" w:sz="4" w:space="0" w:color="000000"/>
+              <w:left w:val="single" w:sz="4" w:space="0" w:color="000000"/>
               <w:bottom w:val="single" w:sz="4" w:space="0" w:color="000000"/>
             </w:tcBorders>
           </w:tcPr>
@@ -1468,7 +1468,7 @@
             <w:pPr>
               <w:pStyle w:val="TableParagraph"/>
               <w:spacing w:before="5" w:after="0"/>
-              <w:ind w:start="108"/>
+              <w:ind w:left="108"/>
               <w:rPr>
                 <w:rFonts w:ascii="Georgia" w:hAnsi="Georgia"/>
                 <w:b/>
@@ -1491,7 +1491,7 @@
             <w:tcW w:w="3938" w:type="dxa"/>
             <w:tcBorders>
               <w:top w:val="single" w:sz="4" w:space="0" w:color="000000"/>
-              <w:start w:val="single" w:sz="4" w:space="0" w:color="000000"/>
+              <w:left w:val="single" w:sz="4" w:space="0" w:color="000000"/>
               <w:bottom w:val="single" w:sz="4" w:space="0" w:color="000000"/>
             </w:tcBorders>
           </w:tcPr>
@@ -1529,7 +1529,7 @@
                 <w:spacing w:val="-4"/>
                 <w:sz w:val="20"/>
               </w:rPr>
-              <w:t xml:space="preserve">name </w:t>
+              <w:t>name</w:t>
             </w:r>
           </w:p>
         </w:tc>
@@ -1538,16 +1538,16 @@
             <w:tcW w:w="2035" w:type="dxa"/>
             <w:tcBorders>
               <w:top w:val="single" w:sz="4" w:space="0" w:color="000000"/>
-              <w:start w:val="single" w:sz="4" w:space="0" w:color="000000"/>
-              <w:bottom w:val="single" w:sz="4" w:space="0" w:color="000000"/>
-              <w:end w:val="single" w:sz="4" w:space="0" w:color="000000"/>
+              <w:left w:val="single" w:sz="4" w:space="0" w:color="000000"/>
+              <w:bottom w:val="single" w:sz="4" w:space="0" w:color="000000"/>
+              <w:right w:val="single" w:sz="4" w:space="0" w:color="000000"/>
             </w:tcBorders>
           </w:tcPr>
           <w:p>
             <w:pPr>
               <w:pStyle w:val="TableParagraph"/>
               <w:spacing w:before="5" w:after="0"/>
-              <w:ind w:start="0"/>
+              <w:ind w:left="0"/>
               <w:rPr>
                 <w:rFonts w:ascii="Georgia" w:hAnsi="Georgia" w:eastAsia="Arial" w:cs="Arial"/>
                 <w:b/>
@@ -1577,7 +1577,7 @@
             <w:pPr>
               <w:pStyle w:val="TableParagraph"/>
               <w:spacing w:before="5" w:after="0"/>
-              <w:ind w:start="0"/>
+              <w:ind w:left="0"/>
               <w:rPr>
                 <w:rFonts w:ascii="Georgia" w:hAnsi="Georgia" w:eastAsia="Arial" w:cs="Arial"/>
                 <w:b/>
@@ -1608,7 +1608,7 @@
             <w:tcW w:w="2881" w:type="dxa"/>
             <w:gridSpan w:val="2"/>
             <w:tcBorders>
-              <w:start w:val="single" w:sz="4" w:space="0" w:color="000000"/>
+              <w:left w:val="single" w:sz="4" w:space="0" w:color="000000"/>
               <w:bottom w:val="single" w:sz="4" w:space="0" w:color="000000"/>
             </w:tcBorders>
           </w:tcPr>
@@ -1672,7 +1672,7 @@
           <w:tcPr>
             <w:tcW w:w="1351" w:type="dxa"/>
             <w:tcBorders>
-              <w:start w:val="single" w:sz="4" w:space="0" w:color="000000"/>
+              <w:left w:val="single" w:sz="4" w:space="0" w:color="000000"/>
               <w:bottom w:val="single" w:sz="4" w:space="0" w:color="000000"/>
             </w:tcBorders>
           </w:tcPr>
@@ -1680,7 +1680,7 @@
             <w:pPr>
               <w:pStyle w:val="TableParagraph"/>
               <w:spacing w:before="5" w:after="0"/>
-              <w:ind w:start="108"/>
+              <w:ind w:left="108"/>
               <w:rPr>
                 <w:rFonts w:ascii="Georgia" w:hAnsi="Georgia"/>
                 <w:b/>
@@ -1702,7 +1702,7 @@
           <w:tcPr>
             <w:tcW w:w="3938" w:type="dxa"/>
             <w:tcBorders>
-              <w:start w:val="single" w:sz="4" w:space="0" w:color="000000"/>
+              <w:left w:val="single" w:sz="4" w:space="0" w:color="000000"/>
               <w:bottom w:val="single" w:sz="4" w:space="0" w:color="000000"/>
             </w:tcBorders>
           </w:tcPr>
@@ -1773,9 +1773,9 @@
           <w:tcPr>
             <w:tcW w:w="2035" w:type="dxa"/>
             <w:tcBorders>
-              <w:start w:val="single" w:sz="4" w:space="0" w:color="000000"/>
-              <w:bottom w:val="single" w:sz="4" w:space="0" w:color="000000"/>
-              <w:end w:val="single" w:sz="4" w:space="0" w:color="000000"/>
+              <w:left w:val="single" w:sz="4" w:space="0" w:color="000000"/>
+              <w:bottom w:val="single" w:sz="4" w:space="0" w:color="000000"/>
+              <w:right w:val="single" w:sz="4" w:space="0" w:color="000000"/>
             </w:tcBorders>
           </w:tcPr>
           <w:p>
@@ -1808,7 +1808,7 @@
           <w:tcPr>
             <w:tcW w:w="1767" w:type="dxa"/>
             <w:tcBorders>
-              <w:start w:val="single" w:sz="4" w:space="0" w:color="000000"/>
+              <w:left w:val="single" w:sz="4" w:space="0" w:color="000000"/>
               <w:bottom w:val="single" w:sz="4" w:space="0" w:color="000000"/>
             </w:tcBorders>
           </w:tcPr>
@@ -1839,7 +1839,7 @@
             <w:tcW w:w="6403" w:type="dxa"/>
             <w:gridSpan w:val="3"/>
             <w:tcBorders>
-              <w:start w:val="single" w:sz="4" w:space="0" w:color="000000"/>
+              <w:left w:val="single" w:sz="4" w:space="0" w:color="000000"/>
               <w:bottom w:val="single" w:sz="4" w:space="0" w:color="000000"/>
             </w:tcBorders>
           </w:tcPr>
@@ -1868,9 +1868,9 @@
           <w:tcPr>
             <w:tcW w:w="2035" w:type="dxa"/>
             <w:tcBorders>
-              <w:start w:val="single" w:sz="4" w:space="0" w:color="000000"/>
-              <w:bottom w:val="single" w:sz="4" w:space="0" w:color="000000"/>
-              <w:end w:val="single" w:sz="4" w:space="0" w:color="000000"/>
+              <w:left w:val="single" w:sz="4" w:space="0" w:color="000000"/>
+              <w:bottom w:val="single" w:sz="4" w:space="0" w:color="000000"/>
+              <w:right w:val="single" w:sz="4" w:space="0" w:color="000000"/>
             </w:tcBorders>
           </w:tcPr>
           <w:p>
@@ -1921,7 +1921,7 @@
           <w:tcPr>
             <w:tcW w:w="1767" w:type="dxa"/>
             <w:tcBorders>
-              <w:start w:val="single" w:sz="4" w:space="0" w:color="000000"/>
+              <w:left w:val="single" w:sz="4" w:space="0" w:color="000000"/>
               <w:bottom w:val="single" w:sz="4" w:space="0" w:color="000000"/>
             </w:tcBorders>
           </w:tcPr>
@@ -1950,7 +1950,7 @@
             <w:tcW w:w="6403" w:type="dxa"/>
             <w:gridSpan w:val="3"/>
             <w:tcBorders>
-              <w:start w:val="single" w:sz="4" w:space="0" w:color="000000"/>
+              <w:left w:val="single" w:sz="4" w:space="0" w:color="000000"/>
               <w:bottom w:val="single" w:sz="4" w:space="0" w:color="000000"/>
             </w:tcBorders>
           </w:tcPr>
@@ -1989,9 +1989,9 @@
           <w:tcPr>
             <w:tcW w:w="2035" w:type="dxa"/>
             <w:tcBorders>
-              <w:start w:val="single" w:sz="4" w:space="0" w:color="000000"/>
-              <w:bottom w:val="single" w:sz="4" w:space="0" w:color="000000"/>
-              <w:end w:val="single" w:sz="4" w:space="0" w:color="000000"/>
+              <w:left w:val="single" w:sz="4" w:space="0" w:color="000000"/>
+              <w:bottom w:val="single" w:sz="4" w:space="0" w:color="000000"/>
+              <w:right w:val="single" w:sz="4" w:space="0" w:color="000000"/>
             </w:tcBorders>
           </w:tcPr>
           <w:p>
@@ -2024,7 +2024,7 @@
           <w:tcPr>
             <w:tcW w:w="1767" w:type="dxa"/>
             <w:tcBorders>
-              <w:start w:val="single" w:sz="4" w:space="0" w:color="000000"/>
+              <w:left w:val="single" w:sz="4" w:space="0" w:color="000000"/>
               <w:bottom w:val="single" w:sz="4" w:space="0" w:color="000000"/>
             </w:tcBorders>
           </w:tcPr>
@@ -2054,7 +2054,7 @@
             <w:tcW w:w="6403" w:type="dxa"/>
             <w:gridSpan w:val="3"/>
             <w:tcBorders>
-              <w:start w:val="single" w:sz="4" w:space="0" w:color="000000"/>
+              <w:left w:val="single" w:sz="4" w:space="0" w:color="000000"/>
               <w:bottom w:val="single" w:sz="4" w:space="0" w:color="000000"/>
             </w:tcBorders>
           </w:tcPr>
@@ -2082,9 +2082,9 @@
           <w:tcPr>
             <w:tcW w:w="2035" w:type="dxa"/>
             <w:tcBorders>
-              <w:start w:val="single" w:sz="4" w:space="0" w:color="000000"/>
-              <w:bottom w:val="single" w:sz="4" w:space="0" w:color="000000"/>
-              <w:end w:val="single" w:sz="4" w:space="0" w:color="000000"/>
+              <w:left w:val="single" w:sz="4" w:space="0" w:color="000000"/>
+              <w:bottom w:val="single" w:sz="4" w:space="0" w:color="000000"/>
+              <w:right w:val="single" w:sz="4" w:space="0" w:color="000000"/>
             </w:tcBorders>
           </w:tcPr>
           <w:p>
@@ -2116,7 +2116,7 @@
           <w:tcPr>
             <w:tcW w:w="1767" w:type="dxa"/>
             <w:tcBorders>
-              <w:start w:val="single" w:sz="4" w:space="0" w:color="000000"/>
+              <w:left w:val="single" w:sz="4" w:space="0" w:color="000000"/>
               <w:bottom w:val="single" w:sz="4" w:space="0" w:color="000000"/>
             </w:tcBorders>
           </w:tcPr>
@@ -2146,7 +2146,7 @@
             <w:tcW w:w="6403" w:type="dxa"/>
             <w:gridSpan w:val="3"/>
             <w:tcBorders>
-              <w:start w:val="single" w:sz="4" w:space="0" w:color="000000"/>
+              <w:left w:val="single" w:sz="4" w:space="0" w:color="000000"/>
               <w:bottom w:val="single" w:sz="4" w:space="0" w:color="000000"/>
             </w:tcBorders>
           </w:tcPr>
@@ -2173,9 +2173,9 @@
           <w:tcPr>
             <w:tcW w:w="2035" w:type="dxa"/>
             <w:tcBorders>
-              <w:start w:val="single" w:sz="4" w:space="0" w:color="000000"/>
-              <w:bottom w:val="single" w:sz="4" w:space="0" w:color="000000"/>
-              <w:end w:val="single" w:sz="4" w:space="0" w:color="000000"/>
+              <w:left w:val="single" w:sz="4" w:space="0" w:color="000000"/>
+              <w:bottom w:val="single" w:sz="4" w:space="0" w:color="000000"/>
+              <w:right w:val="single" w:sz="4" w:space="0" w:color="000000"/>
             </w:tcBorders>
           </w:tcPr>
           <w:p>
@@ -2202,7 +2202,7 @@
     <w:p>
       <w:pPr>
         <w:pStyle w:val="BodyText"/>
-        <w:ind w:start="360"/>
+        <w:ind w:left="360"/>
         <w:rPr>
           <w:b w:val="false"/>
           <w:bCs w:val="false"/>
@@ -2220,7 +2220,7 @@
     <w:p>
       <w:pPr>
         <w:pStyle w:val="BodyText"/>
-        <w:ind w:start="360"/>
+        <w:ind w:left="360"/>
         <w:rPr>
           <w:b w:val="false"/>
           <w:bCs w:val="false"/>
@@ -2243,7 +2243,7 @@
       <w:pPr>
         <w:pStyle w:val="BodyText"/>
         <w:spacing w:before="0" w:after="0"/>
-        <w:ind w:start="360"/>
+        <w:ind w:left="360"/>
         <w:rPr>
           <w:b w:val="false"/>
           <w:bCs w:val="false"/>
@@ -2262,7 +2262,7 @@
       <w:pPr>
         <w:pStyle w:val="BodyText"/>
         <w:spacing w:before="1" w:after="0"/>
-        <w:ind w:start="360"/>
+        <w:ind w:left="360"/>
         <w:rPr/>
       </w:pPr>
       <w:r>
@@ -2289,14 +2289,14 @@
     <w:tbl>
       <w:tblPr>
         <w:tblW w:w="9359" w:type="dxa"/>
-        <w:jc w:val="start"/>
+        <w:jc w:val="left"/>
         <w:tblInd w:w="365" w:type="dxa"/>
         <w:tblLayout w:type="fixed"/>
         <w:tblCellMar>
           <w:top w:w="0" w:type="dxa"/>
-          <w:start w:w="5" w:type="dxa"/>
+          <w:left w:w="5" w:type="dxa"/>
           <w:bottom w:w="0" w:type="dxa"/>
-          <w:end w:w="5" w:type="dxa"/>
+          <w:right w:w="5" w:type="dxa"/>
         </w:tblCellMar>
       </w:tblPr>
       <w:tblGrid>
@@ -2313,9 +2313,9 @@
             <w:tcW w:w="3212" w:type="dxa"/>
             <w:tcBorders>
               <w:top w:val="single" w:sz="4" w:space="0" w:color="000000"/>
-              <w:start w:val="single" w:sz="4" w:space="0" w:color="000000"/>
-              <w:bottom w:val="single" w:sz="4" w:space="0" w:color="000000"/>
-              <w:end w:val="single" w:sz="4" w:space="0" w:color="000000"/>
+              <w:left w:val="single" w:sz="4" w:space="0" w:color="000000"/>
+              <w:bottom w:val="single" w:sz="4" w:space="0" w:color="000000"/>
+              <w:right w:val="single" w:sz="4" w:space="0" w:color="000000"/>
             </w:tcBorders>
           </w:tcPr>
           <w:p>
@@ -2357,16 +2357,16 @@
             <w:tcW w:w="3139" w:type="dxa"/>
             <w:tcBorders>
               <w:top w:val="single" w:sz="4" w:space="0" w:color="000000"/>
-              <w:start w:val="single" w:sz="4" w:space="0" w:color="000000"/>
-              <w:bottom w:val="single" w:sz="4" w:space="0" w:color="000000"/>
-              <w:end w:val="single" w:sz="4" w:space="0" w:color="000000"/>
+              <w:left w:val="single" w:sz="4" w:space="0" w:color="000000"/>
+              <w:bottom w:val="single" w:sz="4" w:space="0" w:color="000000"/>
+              <w:right w:val="single" w:sz="4" w:space="0" w:color="000000"/>
             </w:tcBorders>
           </w:tcPr>
           <w:p>
             <w:pPr>
               <w:pStyle w:val="TableParagraph"/>
               <w:spacing w:before="0" w:after="0"/>
-              <w:ind w:start="0"/>
+              <w:ind w:left="0"/>
               <w:rPr>
                 <w:rFonts w:ascii="Times New Roman" w:hAnsi="Times New Roman"/>
               </w:rPr>
@@ -2383,16 +2383,16 @@
             <w:tcW w:w="3008" w:type="dxa"/>
             <w:tcBorders>
               <w:top w:val="single" w:sz="4" w:space="0" w:color="000000"/>
-              <w:start w:val="single" w:sz="4" w:space="0" w:color="000000"/>
-              <w:bottom w:val="single" w:sz="4" w:space="0" w:color="000000"/>
-              <w:end w:val="single" w:sz="4" w:space="0" w:color="000000"/>
+              <w:left w:val="single" w:sz="4" w:space="0" w:color="000000"/>
+              <w:bottom w:val="single" w:sz="4" w:space="0" w:color="000000"/>
+              <w:right w:val="single" w:sz="4" w:space="0" w:color="000000"/>
             </w:tcBorders>
           </w:tcPr>
           <w:p>
             <w:pPr>
               <w:pStyle w:val="TableParagraph"/>
               <w:spacing w:before="0" w:after="0"/>
-              <w:ind w:start="0"/>
+              <w:ind w:left="0"/>
               <w:rPr>
                 <w:rFonts w:ascii="Times New Roman" w:hAnsi="Times New Roman"/>
               </w:rPr>
@@ -2414,16 +2414,16 @@
             <w:tcW w:w="3212" w:type="dxa"/>
             <w:tcBorders>
               <w:top w:val="single" w:sz="4" w:space="0" w:color="000000"/>
-              <w:start w:val="single" w:sz="4" w:space="0" w:color="000000"/>
-              <w:bottom w:val="single" w:sz="4" w:space="0" w:color="000000"/>
-              <w:end w:val="single" w:sz="4" w:space="0" w:color="000000"/>
+              <w:left w:val="single" w:sz="4" w:space="0" w:color="000000"/>
+              <w:bottom w:val="single" w:sz="4" w:space="0" w:color="000000"/>
+              <w:right w:val="single" w:sz="4" w:space="0" w:color="000000"/>
             </w:tcBorders>
           </w:tcPr>
           <w:p>
             <w:pPr>
               <w:pStyle w:val="TableParagraph"/>
               <w:spacing w:before="0" w:after="0"/>
-              <w:ind w:start="97"/>
+              <w:ind w:left="97"/>
               <w:rPr>
                 <w:rFonts w:ascii="Georgia" w:hAnsi="Georgia"/>
                 <w:sz w:val="20"/>
@@ -2442,16 +2442,16 @@
             <w:tcW w:w="3139" w:type="dxa"/>
             <w:tcBorders>
               <w:top w:val="single" w:sz="4" w:space="0" w:color="000000"/>
-              <w:start w:val="single" w:sz="4" w:space="0" w:color="000000"/>
-              <w:bottom w:val="single" w:sz="4" w:space="0" w:color="000000"/>
-              <w:end w:val="single" w:sz="4" w:space="0" w:color="000000"/>
+              <w:left w:val="single" w:sz="4" w:space="0" w:color="000000"/>
+              <w:bottom w:val="single" w:sz="4" w:space="0" w:color="000000"/>
+              <w:right w:val="single" w:sz="4" w:space="0" w:color="000000"/>
             </w:tcBorders>
           </w:tcPr>
           <w:p>
             <w:pPr>
               <w:pStyle w:val="TableParagraph"/>
               <w:spacing w:before="0" w:after="0"/>
-              <w:ind w:start="0"/>
+              <w:ind w:left="0"/>
               <w:rPr>
                 <w:rFonts w:ascii="Times New Roman" w:hAnsi="Times New Roman"/>
               </w:rPr>
@@ -2468,16 +2468,16 @@
             <w:tcW w:w="3008" w:type="dxa"/>
             <w:tcBorders>
               <w:top w:val="single" w:sz="4" w:space="0" w:color="000000"/>
-              <w:start w:val="single" w:sz="4" w:space="0" w:color="000000"/>
-              <w:bottom w:val="single" w:sz="4" w:space="0" w:color="000000"/>
-              <w:end w:val="single" w:sz="4" w:space="0" w:color="000000"/>
+              <w:left w:val="single" w:sz="4" w:space="0" w:color="000000"/>
+              <w:bottom w:val="single" w:sz="4" w:space="0" w:color="000000"/>
+              <w:right w:val="single" w:sz="4" w:space="0" w:color="000000"/>
             </w:tcBorders>
           </w:tcPr>
           <w:p>
             <w:pPr>
               <w:pStyle w:val="TableParagraph"/>
               <w:spacing w:before="0" w:after="0"/>
-              <w:ind w:start="0"/>
+              <w:ind w:left="0"/>
               <w:rPr>
                 <w:rFonts w:ascii="Times New Roman" w:hAnsi="Times New Roman"/>
               </w:rPr>
@@ -2499,9 +2499,9 @@
             <w:tcW w:w="3212" w:type="dxa"/>
             <w:tcBorders>
               <w:top w:val="single" w:sz="4" w:space="0" w:color="000000"/>
-              <w:start w:val="single" w:sz="4" w:space="0" w:color="000000"/>
-              <w:bottom w:val="single" w:sz="4" w:space="0" w:color="000000"/>
-              <w:end w:val="single" w:sz="4" w:space="0" w:color="000000"/>
+              <w:left w:val="single" w:sz="4" w:space="0" w:color="000000"/>
+              <w:bottom w:val="single" w:sz="4" w:space="0" w:color="000000"/>
+              <w:right w:val="single" w:sz="4" w:space="0" w:color="000000"/>
             </w:tcBorders>
           </w:tcPr>
           <w:p>
@@ -2543,16 +2543,16 @@
             <w:tcW w:w="3139" w:type="dxa"/>
             <w:tcBorders>
               <w:top w:val="single" w:sz="4" w:space="0" w:color="000000"/>
-              <w:start w:val="single" w:sz="4" w:space="0" w:color="000000"/>
-              <w:bottom w:val="single" w:sz="4" w:space="0" w:color="000000"/>
-              <w:end w:val="single" w:sz="4" w:space="0" w:color="000000"/>
+              <w:left w:val="single" w:sz="4" w:space="0" w:color="000000"/>
+              <w:bottom w:val="single" w:sz="4" w:space="0" w:color="000000"/>
+              <w:right w:val="single" w:sz="4" w:space="0" w:color="000000"/>
             </w:tcBorders>
           </w:tcPr>
           <w:p>
             <w:pPr>
               <w:pStyle w:val="TableParagraph"/>
               <w:spacing w:before="0" w:after="0"/>
-              <w:ind w:start="0"/>
+              <w:ind w:left="0"/>
               <w:rPr>
                 <w:rFonts w:ascii="Times New Roman" w:hAnsi="Times New Roman"/>
                 <w:sz w:val="20"/>
@@ -2571,16 +2571,16 @@
             <w:tcW w:w="3008" w:type="dxa"/>
             <w:tcBorders>
               <w:top w:val="single" w:sz="4" w:space="0" w:color="000000"/>
-              <w:start w:val="single" w:sz="4" w:space="0" w:color="000000"/>
-              <w:bottom w:val="single" w:sz="4" w:space="0" w:color="000000"/>
-              <w:end w:val="single" w:sz="4" w:space="0" w:color="000000"/>
+              <w:left w:val="single" w:sz="4" w:space="0" w:color="000000"/>
+              <w:bottom w:val="single" w:sz="4" w:space="0" w:color="000000"/>
+              <w:right w:val="single" w:sz="4" w:space="0" w:color="000000"/>
             </w:tcBorders>
           </w:tcPr>
           <w:p>
             <w:pPr>
               <w:pStyle w:val="TableParagraph"/>
               <w:spacing w:before="0" w:after="0"/>
-              <w:ind w:start="0"/>
+              <w:ind w:left="0"/>
               <w:rPr>
                 <w:rFonts w:ascii="Times New Roman" w:hAnsi="Times New Roman"/>
                 <w:sz w:val="20"/>
@@ -2604,16 +2604,16 @@
             <w:tcW w:w="3212" w:type="dxa"/>
             <w:tcBorders>
               <w:top w:val="single" w:sz="4" w:space="0" w:color="000000"/>
-              <w:start w:val="single" w:sz="4" w:space="0" w:color="000000"/>
-              <w:bottom w:val="single" w:sz="4" w:space="0" w:color="000000"/>
-              <w:end w:val="single" w:sz="4" w:space="0" w:color="000000"/>
+              <w:left w:val="single" w:sz="4" w:space="0" w:color="000000"/>
+              <w:bottom w:val="single" w:sz="4" w:space="0" w:color="000000"/>
+              <w:right w:val="single" w:sz="4" w:space="0" w:color="000000"/>
             </w:tcBorders>
           </w:tcPr>
           <w:p>
             <w:pPr>
               <w:pStyle w:val="TableParagraph"/>
               <w:spacing w:before="0" w:after="0"/>
-              <w:ind w:start="29"/>
+              <w:ind w:left="29"/>
               <w:rPr>
                 <w:rFonts w:ascii="Georgia" w:hAnsi="Georgia"/>
                 <w:sz w:val="20"/>
@@ -2632,16 +2632,16 @@
             <w:tcW w:w="3139" w:type="dxa"/>
             <w:tcBorders>
               <w:top w:val="single" w:sz="4" w:space="0" w:color="000000"/>
-              <w:start w:val="single" w:sz="4" w:space="0" w:color="000000"/>
-              <w:bottom w:val="single" w:sz="4" w:space="0" w:color="000000"/>
-              <w:end w:val="single" w:sz="4" w:space="0" w:color="000000"/>
+              <w:left w:val="single" w:sz="4" w:space="0" w:color="000000"/>
+              <w:bottom w:val="single" w:sz="4" w:space="0" w:color="000000"/>
+              <w:right w:val="single" w:sz="4" w:space="0" w:color="000000"/>
             </w:tcBorders>
           </w:tcPr>
           <w:p>
             <w:pPr>
               <w:pStyle w:val="TableParagraph"/>
               <w:spacing w:before="0" w:after="0"/>
-              <w:ind w:start="207"/>
+              <w:ind w:left="207"/>
               <w:rPr>
                 <w:rFonts w:ascii="Georgia" w:hAnsi="Georgia"/>
                 <w:sz w:val="20"/>
@@ -2660,16 +2660,16 @@
             <w:tcW w:w="3008" w:type="dxa"/>
             <w:tcBorders>
               <w:top w:val="single" w:sz="4" w:space="0" w:color="000000"/>
-              <w:start w:val="single" w:sz="4" w:space="0" w:color="000000"/>
-              <w:bottom w:val="single" w:sz="4" w:space="0" w:color="000000"/>
-              <w:end w:val="single" w:sz="4" w:space="0" w:color="000000"/>
+              <w:left w:val="single" w:sz="4" w:space="0" w:color="000000"/>
+              <w:bottom w:val="single" w:sz="4" w:space="0" w:color="000000"/>
+              <w:right w:val="single" w:sz="4" w:space="0" w:color="000000"/>
             </w:tcBorders>
           </w:tcPr>
           <w:p>
             <w:pPr>
               <w:pStyle w:val="TableParagraph"/>
               <w:spacing w:before="0" w:after="0"/>
-              <w:ind w:start="0"/>
+              <w:ind w:left="0"/>
               <w:rPr>
                 <w:rFonts w:ascii="Times New Roman" w:hAnsi="Times New Roman"/>
               </w:rPr>
@@ -2697,7 +2697,7 @@
       <w:pPr>
         <w:pStyle w:val="BodyText"/>
         <w:spacing w:before="1" w:after="0"/>
-        <w:ind w:start="360"/>
+        <w:ind w:left="360"/>
         <w:rPr/>
       </w:pPr>
       <w:r>
@@ -2743,14 +2743,14 @@
     <w:tbl>
       <w:tblPr>
         <w:tblW w:w="9360" w:type="dxa"/>
-        <w:jc w:val="start"/>
+        <w:jc w:val="left"/>
         <w:tblInd w:w="365" w:type="dxa"/>
         <w:tblLayout w:type="fixed"/>
         <w:tblCellMar>
           <w:top w:w="0" w:type="dxa"/>
-          <w:start w:w="5" w:type="dxa"/>
+          <w:left w:w="5" w:type="dxa"/>
           <w:bottom w:w="0" w:type="dxa"/>
-          <w:end w:w="5" w:type="dxa"/>
+          <w:right w:w="5" w:type="dxa"/>
         </w:tblCellMar>
       </w:tblPr>
       <w:tblGrid>
@@ -2767,9 +2767,9 @@
             <w:gridSpan w:val="2"/>
             <w:tcBorders>
               <w:top w:val="single" w:sz="4" w:space="0" w:color="000000"/>
-              <w:start w:val="single" w:sz="4" w:space="0" w:color="000000"/>
-              <w:bottom w:val="single" w:sz="4" w:space="0" w:color="000000"/>
-              <w:end w:val="single" w:sz="4" w:space="0" w:color="000000"/>
+              <w:left w:val="single" w:sz="4" w:space="0" w:color="000000"/>
+              <w:bottom w:val="single" w:sz="4" w:space="0" w:color="000000"/>
+              <w:right w:val="single" w:sz="4" w:space="0" w:color="000000"/>
             </w:tcBorders>
             <w:vAlign w:val="center"/>
           </w:tcPr>
@@ -2804,9 +2804,9 @@
             <w:tcW w:w="4680" w:type="dxa"/>
             <w:tcBorders>
               <w:top w:val="single" w:sz="4" w:space="0" w:color="000000"/>
-              <w:start w:val="single" w:sz="4" w:space="0" w:color="000000"/>
-              <w:bottom w:val="single" w:sz="4" w:space="0" w:color="000000"/>
-              <w:end w:val="single" w:sz="4" w:space="0" w:color="000000"/>
+              <w:left w:val="single" w:sz="4" w:space="0" w:color="000000"/>
+              <w:bottom w:val="single" w:sz="4" w:space="0" w:color="000000"/>
+              <w:right w:val="single" w:sz="4" w:space="0" w:color="000000"/>
             </w:tcBorders>
             <w:vAlign w:val="bottom"/>
           </w:tcPr>
@@ -2836,9 +2836,9 @@
             <w:tcW w:w="4679" w:type="dxa"/>
             <w:tcBorders>
               <w:top w:val="single" w:sz="4" w:space="0" w:color="000000"/>
-              <w:start w:val="single" w:sz="4" w:space="0" w:color="000000"/>
-              <w:bottom w:val="single" w:sz="4" w:space="0" w:color="000000"/>
-              <w:end w:val="single" w:sz="4" w:space="0" w:color="000000"/>
+              <w:left w:val="single" w:sz="4" w:space="0" w:color="000000"/>
+              <w:bottom w:val="single" w:sz="4" w:space="0" w:color="000000"/>
+              <w:right w:val="single" w:sz="4" w:space="0" w:color="000000"/>
             </w:tcBorders>
             <w:vAlign w:val="bottom"/>
           </w:tcPr>
@@ -2873,7 +2873,7 @@
             <w:tcW w:w="4680" w:type="dxa"/>
             <w:tcBorders>
               <w:top w:val="single" w:sz="4" w:space="0" w:color="000000"/>
-              <w:start w:val="single" w:sz="4" w:space="0" w:color="000000"/>
+              <w:left w:val="single" w:sz="4" w:space="0" w:color="000000"/>
               <w:bottom w:val="single" w:sz="4" w:space="0" w:color="000000"/>
             </w:tcBorders>
             <w:vAlign w:val="bottom"/>
@@ -2902,9 +2902,9 @@
             <w:tcW w:w="4679" w:type="dxa"/>
             <w:tcBorders>
               <w:top w:val="single" w:sz="4" w:space="0" w:color="000000"/>
-              <w:start w:val="single" w:sz="4" w:space="0" w:color="000000"/>
-              <w:bottom w:val="single" w:sz="4" w:space="0" w:color="000000"/>
-              <w:end w:val="single" w:sz="4" w:space="0" w:color="000000"/>
+              <w:left w:val="single" w:sz="4" w:space="0" w:color="000000"/>
+              <w:bottom w:val="single" w:sz="4" w:space="0" w:color="000000"/>
+              <w:right w:val="single" w:sz="4" w:space="0" w:color="000000"/>
             </w:tcBorders>
             <w:vAlign w:val="bottom"/>
           </w:tcPr>
@@ -2936,7 +2936,7 @@
           <w:tcPr>
             <w:tcW w:w="4680" w:type="dxa"/>
             <w:tcBorders>
-              <w:start w:val="single" w:sz="4" w:space="0" w:color="000000"/>
+              <w:left w:val="single" w:sz="4" w:space="0" w:color="000000"/>
               <w:bottom w:val="single" w:sz="4" w:space="0" w:color="000000"/>
             </w:tcBorders>
             <w:vAlign w:val="bottom"/>
@@ -2956,7 +2956,7 @@
                 <w:spacing w:val="-4"/>
                 <w:sz w:val="20"/>
               </w:rPr>
-              <w:t xml:space="preserve">Aditiya Pathak </w:t>
+              <w:t>Aditiya Pathak</w:t>
             </w:r>
           </w:p>
         </w:tc>
@@ -2964,9 +2964,9 @@
           <w:tcPr>
             <w:tcW w:w="4679" w:type="dxa"/>
             <w:tcBorders>
-              <w:start w:val="single" w:sz="4" w:space="0" w:color="000000"/>
-              <w:bottom w:val="single" w:sz="4" w:space="0" w:color="000000"/>
-              <w:end w:val="single" w:sz="4" w:space="0" w:color="000000"/>
+              <w:left w:val="single" w:sz="4" w:space="0" w:color="000000"/>
+              <w:bottom w:val="single" w:sz="4" w:space="0" w:color="000000"/>
+              <w:right w:val="single" w:sz="4" w:space="0" w:color="000000"/>
             </w:tcBorders>
             <w:vAlign w:val="bottom"/>
           </w:tcPr>
@@ -2985,7 +2985,7 @@
                 <w:spacing w:val="-2"/>
                 <w:sz w:val="20"/>
               </w:rPr>
-              <w:t xml:space="preserve">Co-Head </w:t>
+              <w:t>Co-Head</w:t>
             </w:r>
           </w:p>
         </w:tc>
@@ -2998,7 +2998,7 @@
           <w:tcPr>
             <w:tcW w:w="4680" w:type="dxa"/>
             <w:tcBorders>
-              <w:start w:val="single" w:sz="4" w:space="0" w:color="000000"/>
+              <w:left w:val="single" w:sz="4" w:space="0" w:color="000000"/>
               <w:bottom w:val="single" w:sz="4" w:space="0" w:color="000000"/>
             </w:tcBorders>
             <w:vAlign w:val="bottom"/>
@@ -3026,9 +3026,9 @@
           <w:tcPr>
             <w:tcW w:w="4679" w:type="dxa"/>
             <w:tcBorders>
-              <w:start w:val="single" w:sz="4" w:space="0" w:color="000000"/>
-              <w:bottom w:val="single" w:sz="4" w:space="0" w:color="000000"/>
-              <w:end w:val="single" w:sz="4" w:space="0" w:color="000000"/>
+              <w:left w:val="single" w:sz="4" w:space="0" w:color="000000"/>
+              <w:bottom w:val="single" w:sz="4" w:space="0" w:color="000000"/>
+              <w:right w:val="single" w:sz="4" w:space="0" w:color="000000"/>
             </w:tcBorders>
             <w:vAlign w:val="bottom"/>
           </w:tcPr>
@@ -3060,7 +3060,7 @@
           <w:tcPr>
             <w:tcW w:w="4680" w:type="dxa"/>
             <w:tcBorders>
-              <w:start w:val="single" w:sz="4" w:space="0" w:color="000000"/>
+              <w:left w:val="single" w:sz="4" w:space="0" w:color="000000"/>
               <w:bottom w:val="single" w:sz="4" w:space="0" w:color="000000"/>
             </w:tcBorders>
             <w:vAlign w:val="bottom"/>
@@ -3080,7 +3080,7 @@
                 <w:spacing w:val="-2"/>
                 <w:sz w:val="20"/>
               </w:rPr>
-              <w:t xml:space="preserve">Anjali Tomar </w:t>
+              <w:t>Anjali Tomar</w:t>
             </w:r>
           </w:p>
         </w:tc>
@@ -3088,9 +3088,9 @@
           <w:tcPr>
             <w:tcW w:w="4679" w:type="dxa"/>
             <w:tcBorders>
-              <w:start w:val="single" w:sz="4" w:space="0" w:color="000000"/>
-              <w:bottom w:val="single" w:sz="4" w:space="0" w:color="000000"/>
-              <w:end w:val="single" w:sz="4" w:space="0" w:color="000000"/>
+              <w:left w:val="single" w:sz="4" w:space="0" w:color="000000"/>
+              <w:bottom w:val="single" w:sz="4" w:space="0" w:color="000000"/>
+              <w:right w:val="single" w:sz="4" w:space="0" w:color="000000"/>
             </w:tcBorders>
             <w:vAlign w:val="bottom"/>
           </w:tcPr>
@@ -3122,7 +3122,7 @@
           <w:tcPr>
             <w:tcW w:w="4680" w:type="dxa"/>
             <w:tcBorders>
-              <w:start w:val="single" w:sz="4" w:space="0" w:color="000000"/>
+              <w:left w:val="single" w:sz="4" w:space="0" w:color="000000"/>
               <w:bottom w:val="single" w:sz="4" w:space="0" w:color="000000"/>
             </w:tcBorders>
             <w:vAlign w:val="bottom"/>
@@ -3149,9 +3149,9 @@
           <w:tcPr>
             <w:tcW w:w="4679" w:type="dxa"/>
             <w:tcBorders>
-              <w:start w:val="single" w:sz="4" w:space="0" w:color="000000"/>
-              <w:bottom w:val="single" w:sz="4" w:space="0" w:color="000000"/>
-              <w:end w:val="single" w:sz="4" w:space="0" w:color="000000"/>
+              <w:left w:val="single" w:sz="4" w:space="0" w:color="000000"/>
+              <w:bottom w:val="single" w:sz="4" w:space="0" w:color="000000"/>
+              <w:right w:val="single" w:sz="4" w:space="0" w:color="000000"/>
             </w:tcBorders>
             <w:vAlign w:val="bottom"/>
           </w:tcPr>
@@ -3182,7 +3182,7 @@
           <w:tcPr>
             <w:tcW w:w="4680" w:type="dxa"/>
             <w:tcBorders>
-              <w:start w:val="single" w:sz="4" w:space="0" w:color="000000"/>
+              <w:left w:val="single" w:sz="4" w:space="0" w:color="000000"/>
               <w:bottom w:val="single" w:sz="4" w:space="0" w:color="000000"/>
             </w:tcBorders>
             <w:vAlign w:val="bottom"/>
@@ -3201,7 +3201,7 @@
                 <w:rFonts w:ascii="Georgia" w:hAnsi="Georgia"/>
                 <w:sz w:val="20"/>
               </w:rPr>
-              <w:t xml:space="preserve">Ayush Singh Kushwaha </w:t>
+              <w:t>Ayush Singh Kushwaha</w:t>
             </w:r>
           </w:p>
         </w:tc>
@@ -3209,9 +3209,9 @@
           <w:tcPr>
             <w:tcW w:w="4679" w:type="dxa"/>
             <w:tcBorders>
-              <w:start w:val="single" w:sz="4" w:space="0" w:color="000000"/>
-              <w:bottom w:val="single" w:sz="4" w:space="0" w:color="000000"/>
-              <w:end w:val="single" w:sz="4" w:space="0" w:color="000000"/>
+              <w:left w:val="single" w:sz="4" w:space="0" w:color="000000"/>
+              <w:bottom w:val="single" w:sz="4" w:space="0" w:color="000000"/>
+              <w:right w:val="single" w:sz="4" w:space="0" w:color="000000"/>
             </w:tcBorders>
             <w:vAlign w:val="bottom"/>
           </w:tcPr>
@@ -3229,7 +3229,7 @@
                 <w:rFonts w:ascii="Georgia" w:hAnsi="Georgia"/>
                 <w:sz w:val="20"/>
               </w:rPr>
-              <w:t xml:space="preserve">Documentation </w:t>
+              <w:t>Documentation</w:t>
             </w:r>
           </w:p>
         </w:tc>
@@ -3242,7 +3242,7 @@
           <w:tcPr>
             <w:tcW w:w="4680" w:type="dxa"/>
             <w:tcBorders>
-              <w:start w:val="single" w:sz="4" w:space="0" w:color="000000"/>
+              <w:left w:val="single" w:sz="4" w:space="0" w:color="000000"/>
               <w:bottom w:val="single" w:sz="4" w:space="0" w:color="000000"/>
             </w:tcBorders>
             <w:vAlign w:val="bottom"/>
@@ -3261,7 +3261,7 @@
                 <w:rFonts w:ascii="Georgia" w:hAnsi="Georgia"/>
                 <w:sz w:val="20"/>
               </w:rPr>
-              <w:t xml:space="preserve">Satyam Gupta </w:t>
+              <w:t>Satyam Gupta</w:t>
             </w:r>
           </w:p>
         </w:tc>
@@ -3269,9 +3269,9 @@
           <w:tcPr>
             <w:tcW w:w="4679" w:type="dxa"/>
             <w:tcBorders>
-              <w:start w:val="single" w:sz="4" w:space="0" w:color="000000"/>
-              <w:bottom w:val="single" w:sz="4" w:space="0" w:color="000000"/>
-              <w:end w:val="single" w:sz="4" w:space="0" w:color="000000"/>
+              <w:left w:val="single" w:sz="4" w:space="0" w:color="000000"/>
+              <w:bottom w:val="single" w:sz="4" w:space="0" w:color="000000"/>
+              <w:right w:val="single" w:sz="4" w:space="0" w:color="000000"/>
             </w:tcBorders>
             <w:vAlign w:val="bottom"/>
           </w:tcPr>
@@ -3289,7 +3289,7 @@
                 <w:rFonts w:ascii="Georgia" w:hAnsi="Georgia"/>
                 <w:sz w:val="20"/>
               </w:rPr>
-              <w:t xml:space="preserve">R&amp;D </w:t>
+              <w:t>R&amp;D</w:t>
             </w:r>
           </w:p>
         </w:tc>
@@ -3312,14 +3312,14 @@
     <w:tbl>
       <w:tblPr>
         <w:tblW w:w="9360" w:type="dxa"/>
-        <w:jc w:val="start"/>
+        <w:jc w:val="left"/>
         <w:tblInd w:w="365" w:type="dxa"/>
         <w:tblLayout w:type="fixed"/>
         <w:tblCellMar>
           <w:top w:w="0" w:type="dxa"/>
-          <w:start w:w="5" w:type="dxa"/>
+          <w:left w:w="5" w:type="dxa"/>
           <w:bottom w:w="0" w:type="dxa"/>
-          <w:end w:w="5" w:type="dxa"/>
+          <w:right w:w="5" w:type="dxa"/>
         </w:tblCellMar>
       </w:tblPr>
       <w:tblGrid>
@@ -3336,9 +3336,9 @@
             <w:gridSpan w:val="2"/>
             <w:tcBorders>
               <w:top w:val="single" w:sz="4" w:space="0" w:color="000000"/>
-              <w:start w:val="single" w:sz="4" w:space="0" w:color="000000"/>
-              <w:bottom w:val="single" w:sz="4" w:space="0" w:color="000000"/>
-              <w:end w:val="single" w:sz="4" w:space="0" w:color="000000"/>
+              <w:left w:val="single" w:sz="4" w:space="0" w:color="000000"/>
+              <w:bottom w:val="single" w:sz="4" w:space="0" w:color="000000"/>
+              <w:right w:val="single" w:sz="4" w:space="0" w:color="000000"/>
             </w:tcBorders>
             <w:vAlign w:val="center"/>
           </w:tcPr>
@@ -3359,7 +3359,7 @@
                 <w:spacing w:val="-2"/>
                 <w:sz w:val="20"/>
               </w:rPr>
-              <w:t xml:space="preserve">ITM Universe’s  Faculty </w:t>
+              <w:t>ITM Universe’s  Faculty</w:t>
             </w:r>
           </w:p>
         </w:tc>
@@ -3373,9 +3373,9 @@
             <w:tcW w:w="4680" w:type="dxa"/>
             <w:tcBorders>
               <w:top w:val="single" w:sz="4" w:space="0" w:color="000000"/>
-              <w:start w:val="single" w:sz="4" w:space="0" w:color="000000"/>
-              <w:bottom w:val="single" w:sz="4" w:space="0" w:color="000000"/>
-              <w:end w:val="single" w:sz="4" w:space="0" w:color="000000"/>
+              <w:left w:val="single" w:sz="4" w:space="0" w:color="000000"/>
+              <w:bottom w:val="single" w:sz="4" w:space="0" w:color="000000"/>
+              <w:right w:val="single" w:sz="4" w:space="0" w:color="000000"/>
             </w:tcBorders>
             <w:vAlign w:val="bottom"/>
           </w:tcPr>
@@ -3407,9 +3407,9 @@
             <w:tcW w:w="4679" w:type="dxa"/>
             <w:tcBorders>
               <w:top w:val="single" w:sz="4" w:space="0" w:color="000000"/>
-              <w:start w:val="single" w:sz="4" w:space="0" w:color="000000"/>
-              <w:bottom w:val="single" w:sz="4" w:space="0" w:color="000000"/>
-              <w:end w:val="single" w:sz="4" w:space="0" w:color="000000"/>
+              <w:left w:val="single" w:sz="4" w:space="0" w:color="000000"/>
+              <w:bottom w:val="single" w:sz="4" w:space="0" w:color="000000"/>
+              <w:right w:val="single" w:sz="4" w:space="0" w:color="000000"/>
             </w:tcBorders>
             <w:vAlign w:val="bottom"/>
           </w:tcPr>
@@ -3417,7 +3417,7 @@
             <w:pPr>
               <w:pStyle w:val="TableParagraph"/>
               <w:spacing w:lineRule="exact" w:line="202" w:before="5" w:after="0"/>
-              <w:ind w:start="108"/>
+              <w:ind w:left="108"/>
               <w:rPr>
                 <w:b/>
                 <w:bCs/>
@@ -3445,9 +3445,9 @@
             <w:tcW w:w="4680" w:type="dxa"/>
             <w:tcBorders>
               <w:top w:val="single" w:sz="4" w:space="0" w:color="000000"/>
-              <w:start w:val="single" w:sz="4" w:space="0" w:color="000000"/>
-              <w:bottom w:val="single" w:sz="4" w:space="0" w:color="000000"/>
-              <w:end w:val="single" w:sz="4" w:space="0" w:color="000000"/>
+              <w:left w:val="single" w:sz="4" w:space="0" w:color="000000"/>
+              <w:bottom w:val="single" w:sz="4" w:space="0" w:color="000000"/>
+              <w:right w:val="single" w:sz="4" w:space="0" w:color="000000"/>
             </w:tcBorders>
             <w:vAlign w:val="bottom"/>
           </w:tcPr>
@@ -3482,9 +3482,9 @@
             <w:tcW w:w="4679" w:type="dxa"/>
             <w:tcBorders>
               <w:top w:val="single" w:sz="4" w:space="0" w:color="000000"/>
-              <w:start w:val="single" w:sz="4" w:space="0" w:color="000000"/>
-              <w:bottom w:val="single" w:sz="4" w:space="0" w:color="000000"/>
-              <w:end w:val="single" w:sz="4" w:space="0" w:color="000000"/>
+              <w:left w:val="single" w:sz="4" w:space="0" w:color="000000"/>
+              <w:bottom w:val="single" w:sz="4" w:space="0" w:color="000000"/>
+              <w:right w:val="single" w:sz="4" w:space="0" w:color="000000"/>
             </w:tcBorders>
             <w:vAlign w:val="bottom"/>
           </w:tcPr>
@@ -3492,7 +3492,7 @@
             <w:pPr>
               <w:pStyle w:val="TableParagraph"/>
               <w:spacing w:lineRule="exact" w:line="202" w:before="5" w:after="0"/>
-              <w:ind w:start="108"/>
+              <w:ind w:left="108"/>
               <w:rPr>
                 <w:rFonts w:ascii="Georgia" w:hAnsi="Georgia"/>
                 <w:sz w:val="20"/>
@@ -3504,7 +3504,7 @@
                 <w:spacing w:val="-4"/>
                 <w:sz w:val="20"/>
               </w:rPr>
-              <w:t xml:space="preserve">Professor of Practice </w:t>
+              <w:t>Professor of Practice</w:t>
             </w:r>
           </w:p>
         </w:tc>
@@ -3518,9 +3518,9 @@
             <w:tcW w:w="4680" w:type="dxa"/>
             <w:tcBorders>
               <w:top w:val="single" w:sz="4" w:space="0" w:color="000000"/>
-              <w:start w:val="single" w:sz="4" w:space="0" w:color="000000"/>
-              <w:bottom w:val="single" w:sz="4" w:space="0" w:color="000000"/>
-              <w:end w:val="single" w:sz="4" w:space="0" w:color="000000"/>
+              <w:left w:val="single" w:sz="4" w:space="0" w:color="000000"/>
+              <w:bottom w:val="single" w:sz="4" w:space="0" w:color="000000"/>
+              <w:right w:val="single" w:sz="4" w:space="0" w:color="000000"/>
             </w:tcBorders>
             <w:vAlign w:val="bottom"/>
           </w:tcPr>
@@ -3539,7 +3539,7 @@
                 <w:spacing w:val="-2"/>
                 <w:sz w:val="20"/>
               </w:rPr>
-              <w:t xml:space="preserve">Akash Shukla </w:t>
+              <w:t>Akash Shukla</w:t>
             </w:r>
           </w:p>
         </w:tc>
@@ -3548,9 +3548,9 @@
             <w:tcW w:w="4679" w:type="dxa"/>
             <w:tcBorders>
               <w:top w:val="single" w:sz="4" w:space="0" w:color="000000"/>
-              <w:start w:val="single" w:sz="4" w:space="0" w:color="000000"/>
-              <w:bottom w:val="single" w:sz="4" w:space="0" w:color="000000"/>
-              <w:end w:val="single" w:sz="4" w:space="0" w:color="000000"/>
+              <w:left w:val="single" w:sz="4" w:space="0" w:color="000000"/>
+              <w:bottom w:val="single" w:sz="4" w:space="0" w:color="000000"/>
+              <w:right w:val="single" w:sz="4" w:space="0" w:color="000000"/>
             </w:tcBorders>
             <w:vAlign w:val="bottom"/>
           </w:tcPr>
@@ -3558,7 +3558,7 @@
             <w:pPr>
               <w:pStyle w:val="TableParagraph"/>
               <w:spacing w:lineRule="exact" w:line="202" w:before="5" w:after="0"/>
-              <w:ind w:start="108"/>
+              <w:ind w:left="108"/>
               <w:rPr>
                 <w:rFonts w:ascii="Georgia" w:hAnsi="Georgia"/>
                 <w:sz w:val="20"/>
@@ -3570,7 +3570,7 @@
                 <w:spacing w:val="-4"/>
                 <w:sz w:val="20"/>
               </w:rPr>
-              <w:t xml:space="preserve">Head of Ideapad </w:t>
+              <w:t>Head of Ideapad</w:t>
             </w:r>
           </w:p>
         </w:tc>
@@ -3589,7 +3589,7 @@
       <w:pPr>
         <w:pStyle w:val="BodyText"/>
         <w:spacing w:before="1" w:after="0"/>
-        <w:ind w:start="360"/>
+        <w:ind w:left="360"/>
         <w:rPr>
           <w:color w:val="7F7F7F"/>
           <w:spacing w:val="-5"/>
@@ -3613,7 +3613,7 @@
       <w:pPr>
         <w:pStyle w:val="BodyText"/>
         <w:spacing w:before="0" w:after="0"/>
-        <w:ind w:start="360"/>
+        <w:ind w:left="360"/>
         <w:rPr>
           <w:color w:val="7F7F7F"/>
           <w:spacing w:val="-5"/>
@@ -3818,7 +3818,7 @@
           <w:ilvl w:val="0"/>
           <w:numId w:val="0"/>
         </w:numPr>
-        <w:ind w:hanging="0" w:start="720"/>
+        <w:ind w:hanging="0" w:left="720"/>
         <w:rPr/>
       </w:pPr>
       <w:r>
@@ -3826,14 +3826,7 @@
           <w:b/>
           <w:bCs/>
         </w:rPr>
-        <w:t xml:space="preserve">(example - </w:t>
-      </w:r>
-      <w:r>
-        <w:rPr>
-          <w:b/>
-          <w:bCs/>
-        </w:rPr>
-        <w:t>iDEX:</w:t>
+        <w:t>(example - iDEX:</w:t>
       </w:r>
       <w:r>
         <w:rPr/>
@@ -3893,11 +3886,7 @@
       </w:r>
       <w:r>
         <w:rPr/>
-        <w:t xml:space="preserve"> (early-stage concepts in military hardware).</w:t>
-      </w:r>
-      <w:r>
-        <w:rPr/>
-        <w:t>)</w:t>
+        <w:t xml:space="preserve"> (early-stage concepts in military hardware).)</w:t>
       </w:r>
     </w:p>
     <w:p>
@@ -3959,7 +3948,7 @@
           <w:ilvl w:val="0"/>
           <w:numId w:val="0"/>
         </w:numPr>
-        <w:ind w:hanging="0" w:start="720"/>
+        <w:ind w:hanging="0" w:left="720"/>
         <w:rPr/>
       </w:pPr>
       <w:r>
@@ -3985,7 +3974,7 @@
           <w:ilvl w:val="0"/>
           <w:numId w:val="0"/>
         </w:numPr>
-        <w:ind w:hanging="0" w:start="720"/>
+        <w:ind w:hanging="0" w:left="720"/>
         <w:rPr/>
       </w:pPr>
       <w:r>
@@ -4053,7 +4042,7 @@
           <w:ilvl w:val="0"/>
           <w:numId w:val="0"/>
         </w:numPr>
-        <w:ind w:hanging="0" w:start="720"/>
+        <w:ind w:hanging="0" w:left="720"/>
         <w:rPr/>
       </w:pPr>
       <w:r>
@@ -4106,12 +4095,12 @@
       <w:start w:val="1"/>
       <w:numFmt w:val="bullet"/>
       <w:lvlText w:val=""/>
-      <w:lvlJc w:val="start"/>
+      <w:lvlJc w:val="left"/>
       <w:pPr>
         <w:tabs>
           <w:tab w:val="num" w:pos="720"/>
         </w:tabs>
-        <w:ind w:start="720" w:hanging="360"/>
+        <w:ind w:left="720" w:hanging="360"/>
       </w:pPr>
       <w:rPr>
         <w:rFonts w:ascii="Symbol" w:hAnsi="Symbol" w:cs="Symbol" w:hint="default"/>
@@ -4121,12 +4110,12 @@
       <w:start w:val="1"/>
       <w:numFmt w:val="bullet"/>
       <w:lvlText w:val="◦"/>
-      <w:lvlJc w:val="start"/>
+      <w:lvlJc w:val="left"/>
       <w:pPr>
         <w:tabs>
           <w:tab w:val="num" w:pos="1080"/>
         </w:tabs>
-        <w:ind w:start="1080" w:hanging="360"/>
+        <w:ind w:left="1080" w:hanging="360"/>
       </w:pPr>
       <w:rPr>
         <w:rFonts w:ascii="OpenSymbol" w:hAnsi="OpenSymbol" w:cs="OpenSymbol" w:hint="default"/>
@@ -4136,12 +4125,12 @@
       <w:start w:val="1"/>
       <w:numFmt w:val="bullet"/>
       <w:lvlText w:val="▪"/>
-      <w:lvlJc w:val="start"/>
+      <w:lvlJc w:val="left"/>
       <w:pPr>
         <w:tabs>
           <w:tab w:val="num" w:pos="1440"/>
         </w:tabs>
-        <w:ind w:start="1440" w:hanging="360"/>
+        <w:ind w:left="1440" w:hanging="360"/>
       </w:pPr>
       <w:rPr>
         <w:rFonts w:ascii="OpenSymbol" w:hAnsi="OpenSymbol" w:cs="OpenSymbol" w:hint="default"/>
@@ -4151,12 +4140,12 @@
       <w:start w:val="1"/>
       <w:numFmt w:val="bullet"/>
       <w:lvlText w:val=""/>
-      <w:lvlJc w:val="start"/>
+      <w:lvlJc w:val="left"/>
       <w:pPr>
         <w:tabs>
           <w:tab w:val="num" w:pos="1800"/>
         </w:tabs>
-        <w:ind w:start="1800" w:hanging="360"/>
+        <w:ind w:left="1800" w:hanging="360"/>
       </w:pPr>
       <w:rPr>
         <w:rFonts w:ascii="Symbol" w:hAnsi="Symbol" w:cs="Symbol" w:hint="default"/>
@@ -4166,12 +4155,12 @@
       <w:start w:val="1"/>
       <w:numFmt w:val="bullet"/>
       <w:lvlText w:val="◦"/>
-      <w:lvlJc w:val="start"/>
+      <w:lvlJc w:val="left"/>
       <w:pPr>
         <w:tabs>
           <w:tab w:val="num" w:pos="2160"/>
         </w:tabs>
-        <w:ind w:start="2160" w:hanging="360"/>
+        <w:ind w:left="2160" w:hanging="360"/>
       </w:pPr>
       <w:rPr>
         <w:rFonts w:ascii="OpenSymbol" w:hAnsi="OpenSymbol" w:cs="OpenSymbol" w:hint="default"/>
@@ -4181,12 +4170,12 @@
       <w:start w:val="1"/>
       <w:numFmt w:val="bullet"/>
       <w:lvlText w:val="▪"/>
-      <w:lvlJc w:val="start"/>
+      <w:lvlJc w:val="left"/>
       <w:pPr>
         <w:tabs>
           <w:tab w:val="num" w:pos="2520"/>
         </w:tabs>
-        <w:ind w:start="2520" w:hanging="360"/>
+        <w:ind w:left="2520" w:hanging="360"/>
       </w:pPr>
       <w:rPr>
         <w:rFonts w:ascii="OpenSymbol" w:hAnsi="OpenSymbol" w:cs="OpenSymbol" w:hint="default"/>
@@ -4196,12 +4185,12 @@
       <w:start w:val="1"/>
       <w:numFmt w:val="bullet"/>
       <w:lvlText w:val=""/>
-      <w:lvlJc w:val="start"/>
+      <w:lvlJc w:val="left"/>
       <w:pPr>
         <w:tabs>
           <w:tab w:val="num" w:pos="2880"/>
         </w:tabs>
-        <w:ind w:start="2880" w:hanging="360"/>
+        <w:ind w:left="2880" w:hanging="360"/>
       </w:pPr>
       <w:rPr>
         <w:rFonts w:ascii="Symbol" w:hAnsi="Symbol" w:cs="Symbol" w:hint="default"/>
@@ -4211,12 +4200,12 @@
       <w:start w:val="1"/>
       <w:numFmt w:val="bullet"/>
       <w:lvlText w:val="◦"/>
-      <w:lvlJc w:val="start"/>
+      <w:lvlJc w:val="left"/>
       <w:pPr>
         <w:tabs>
           <w:tab w:val="num" w:pos="3240"/>
         </w:tabs>
-        <w:ind w:start="3240" w:hanging="360"/>
+        <w:ind w:left="3240" w:hanging="360"/>
       </w:pPr>
       <w:rPr>
         <w:rFonts w:ascii="OpenSymbol" w:hAnsi="OpenSymbol" w:cs="OpenSymbol" w:hint="default"/>
@@ -4226,12 +4215,12 @@
       <w:start w:val="1"/>
       <w:numFmt w:val="bullet"/>
       <w:lvlText w:val="▪"/>
-      <w:lvlJc w:val="start"/>
+      <w:lvlJc w:val="left"/>
       <w:pPr>
         <w:tabs>
           <w:tab w:val="num" w:pos="3600"/>
         </w:tabs>
-        <w:ind w:start="3600" w:hanging="360"/>
+        <w:ind w:left="3600" w:hanging="360"/>
       </w:pPr>
       <w:rPr>
         <w:rFonts w:ascii="OpenSymbol" w:hAnsi="OpenSymbol" w:cs="OpenSymbol" w:hint="default"/>
@@ -4243,12 +4232,12 @@
       <w:start w:val="1"/>
       <w:numFmt w:val="bullet"/>
       <w:lvlText w:val=""/>
-      <w:lvlJc w:val="start"/>
+      <w:lvlJc w:val="left"/>
       <w:pPr>
         <w:tabs>
           <w:tab w:val="num" w:pos="720"/>
         </w:tabs>
-        <w:ind w:start="720" w:hanging="360"/>
+        <w:ind w:left="720" w:hanging="360"/>
       </w:pPr>
       <w:rPr>
         <w:rFonts w:ascii="Symbol" w:hAnsi="Symbol" w:cs="Symbol" w:hint="default"/>
@@ -4258,12 +4247,12 @@
       <w:start w:val="1"/>
       <w:numFmt w:val="bullet"/>
       <w:lvlText w:val="◦"/>
-      <w:lvlJc w:val="start"/>
+      <w:lvlJc w:val="left"/>
       <w:pPr>
         <w:tabs>
           <w:tab w:val="num" w:pos="1080"/>
         </w:tabs>
-        <w:ind w:start="1080" w:hanging="360"/>
+        <w:ind w:left="1080" w:hanging="360"/>
       </w:pPr>
       <w:rPr>
         <w:rFonts w:ascii="OpenSymbol" w:hAnsi="OpenSymbol" w:cs="OpenSymbol" w:hint="default"/>
@@ -4273,12 +4262,12 @@
       <w:start w:val="1"/>
       <w:numFmt w:val="bullet"/>
       <w:lvlText w:val="▪"/>
-      <w:lvlJc w:val="start"/>
+      <w:lvlJc w:val="left"/>
       <w:pPr>
         <w:tabs>
           <w:tab w:val="num" w:pos="1440"/>
         </w:tabs>
-        <w:ind w:start="1440" w:hanging="360"/>
+        <w:ind w:left="1440" w:hanging="360"/>
       </w:pPr>
       <w:rPr>
         <w:rFonts w:ascii="OpenSymbol" w:hAnsi="OpenSymbol" w:cs="OpenSymbol" w:hint="default"/>
@@ -4288,12 +4277,12 @@
       <w:start w:val="1"/>
       <w:numFmt w:val="bullet"/>
       <w:lvlText w:val=""/>
-      <w:lvlJc w:val="start"/>
+      <w:lvlJc w:val="left"/>
       <w:pPr>
         <w:tabs>
           <w:tab w:val="num" w:pos="1800"/>
         </w:tabs>
-        <w:ind w:start="1800" w:hanging="360"/>
+        <w:ind w:left="1800" w:hanging="360"/>
       </w:pPr>
       <w:rPr>
         <w:rFonts w:ascii="Symbol" w:hAnsi="Symbol" w:cs="Symbol" w:hint="default"/>
@@ -4303,12 +4292,12 @@
       <w:start w:val="1"/>
       <w:numFmt w:val="bullet"/>
       <w:lvlText w:val="◦"/>
-      <w:lvlJc w:val="start"/>
+      <w:lvlJc w:val="left"/>
       <w:pPr>
         <w:tabs>
           <w:tab w:val="num" w:pos="2160"/>
         </w:tabs>
-        <w:ind w:start="2160" w:hanging="360"/>
+        <w:ind w:left="2160" w:hanging="360"/>
       </w:pPr>
       <w:rPr>
         <w:rFonts w:ascii="OpenSymbol" w:hAnsi="OpenSymbol" w:cs="OpenSymbol" w:hint="default"/>
@@ -4318,12 +4307,12 @@
       <w:start w:val="1"/>
       <w:numFmt w:val="bullet"/>
       <w:lvlText w:val="▪"/>
-      <w:lvlJc w:val="start"/>
+      <w:lvlJc w:val="left"/>
       <w:pPr>
         <w:tabs>
           <w:tab w:val="num" w:pos="2520"/>
         </w:tabs>
-        <w:ind w:start="2520" w:hanging="360"/>
+        <w:ind w:left="2520" w:hanging="360"/>
       </w:pPr>
       <w:rPr>
         <w:rFonts w:ascii="OpenSymbol" w:hAnsi="OpenSymbol" w:cs="OpenSymbol" w:hint="default"/>
@@ -4333,12 +4322,12 @@
       <w:start w:val="1"/>
       <w:numFmt w:val="bullet"/>
       <w:lvlText w:val=""/>
-      <w:lvlJc w:val="start"/>
+      <w:lvlJc w:val="left"/>
       <w:pPr>
         <w:tabs>
           <w:tab w:val="num" w:pos="2880"/>
         </w:tabs>
-        <w:ind w:start="2880" w:hanging="360"/>
+        <w:ind w:left="2880" w:hanging="360"/>
       </w:pPr>
       <w:rPr>
         <w:rFonts w:ascii="Symbol" w:hAnsi="Symbol" w:cs="Symbol" w:hint="default"/>
@@ -4348,12 +4337,12 @@
       <w:start w:val="1"/>
       <w:numFmt w:val="bullet"/>
       <w:lvlText w:val="◦"/>
-      <w:lvlJc w:val="start"/>
+      <w:lvlJc w:val="left"/>
       <w:pPr>
         <w:tabs>
           <w:tab w:val="num" w:pos="3240"/>
         </w:tabs>
-        <w:ind w:start="3240" w:hanging="360"/>
+        <w:ind w:left="3240" w:hanging="360"/>
       </w:pPr>
       <w:rPr>
         <w:rFonts w:ascii="OpenSymbol" w:hAnsi="OpenSymbol" w:cs="OpenSymbol" w:hint="default"/>
@@ -4363,12 +4352,12 @@
       <w:start w:val="1"/>
       <w:numFmt w:val="bullet"/>
       <w:lvlText w:val="▪"/>
-      <w:lvlJc w:val="start"/>
+      <w:lvlJc w:val="left"/>
       <w:pPr>
         <w:tabs>
           <w:tab w:val="num" w:pos="3600"/>
         </w:tabs>
-        <w:ind w:start="3600" w:hanging="360"/>
+        <w:ind w:left="3600" w:hanging="360"/>
       </w:pPr>
       <w:rPr>
         <w:rFonts w:ascii="OpenSymbol" w:hAnsi="OpenSymbol" w:cs="OpenSymbol" w:hint="default"/>
@@ -4381,12 +4370,12 @@
       <w:numFmt w:val="none"/>
       <w:suff w:val="nothing"/>
       <w:lvlText w:val=""/>
-      <w:lvlJc w:val="start"/>
+      <w:lvlJc w:val="left"/>
       <w:pPr>
         <w:tabs>
           <w:tab w:val="num" w:pos="0"/>
         </w:tabs>
-        <w:ind w:start="0" w:hanging="0"/>
+        <w:ind w:left="0" w:hanging="0"/>
       </w:pPr>
     </w:lvl>
     <w:lvl w:ilvl="1">
@@ -4394,12 +4383,12 @@
       <w:numFmt w:val="none"/>
       <w:suff w:val="nothing"/>
       <w:lvlText w:val=""/>
-      <w:lvlJc w:val="start"/>
+      <w:lvlJc w:val="left"/>
       <w:pPr>
         <w:tabs>
           <w:tab w:val="num" w:pos="0"/>
         </w:tabs>
-        <w:ind w:start="0" w:hanging="0"/>
+        <w:ind w:left="0" w:hanging="0"/>
       </w:pPr>
     </w:lvl>
     <w:lvl w:ilvl="2">
@@ -4407,12 +4396,12 @@
       <w:numFmt w:val="none"/>
       <w:suff w:val="nothing"/>
       <w:lvlText w:val=""/>
-      <w:lvlJc w:val="start"/>
+      <w:lvlJc w:val="left"/>
       <w:pPr>
         <w:tabs>
           <w:tab w:val="num" w:pos="0"/>
         </w:tabs>
-        <w:ind w:start="0" w:hanging="0"/>
+        <w:ind w:left="0" w:hanging="0"/>
       </w:pPr>
     </w:lvl>
     <w:lvl w:ilvl="3">
@@ -4420,12 +4409,12 @@
       <w:numFmt w:val="none"/>
       <w:suff w:val="nothing"/>
       <w:lvlText w:val=""/>
-      <w:lvlJc w:val="start"/>
+      <w:lvlJc w:val="left"/>
       <w:pPr>
         <w:tabs>
           <w:tab w:val="num" w:pos="0"/>
         </w:tabs>
-        <w:ind w:start="0" w:hanging="0"/>
+        <w:ind w:left="0" w:hanging="0"/>
       </w:pPr>
     </w:lvl>
     <w:lvl w:ilvl="4">
@@ -4433,12 +4422,12 @@
       <w:numFmt w:val="none"/>
       <w:suff w:val="nothing"/>
       <w:lvlText w:val=""/>
-      <w:lvlJc w:val="start"/>
+      <w:lvlJc w:val="left"/>
       <w:pPr>
         <w:tabs>
           <w:tab w:val="num" w:pos="0"/>
         </w:tabs>
-        <w:ind w:start="0" w:hanging="0"/>
+        <w:ind w:left="0" w:hanging="0"/>
       </w:pPr>
     </w:lvl>
     <w:lvl w:ilvl="5">
@@ -4446,12 +4435,12 @@
       <w:numFmt w:val="none"/>
       <w:suff w:val="nothing"/>
       <w:lvlText w:val=""/>
-      <w:lvlJc w:val="start"/>
+      <w:lvlJc w:val="left"/>
       <w:pPr>
         <w:tabs>
           <w:tab w:val="num" w:pos="0"/>
         </w:tabs>
-        <w:ind w:start="0" w:hanging="0"/>
+        <w:ind w:left="0" w:hanging="0"/>
       </w:pPr>
     </w:lvl>
     <w:lvl w:ilvl="6">
@@ -4459,12 +4448,12 @@
       <w:numFmt w:val="none"/>
       <w:suff w:val="nothing"/>
       <w:lvlText w:val=""/>
-      <w:lvlJc w:val="start"/>
+      <w:lvlJc w:val="left"/>
       <w:pPr>
         <w:tabs>
           <w:tab w:val="num" w:pos="0"/>
         </w:tabs>
-        <w:ind w:start="0" w:hanging="0"/>
+        <w:ind w:left="0" w:hanging="0"/>
       </w:pPr>
     </w:lvl>
     <w:lvl w:ilvl="7">
@@ -4472,12 +4461,12 @@
       <w:numFmt w:val="none"/>
       <w:suff w:val="nothing"/>
       <w:lvlText w:val=""/>
-      <w:lvlJc w:val="start"/>
+      <w:lvlJc w:val="left"/>
       <w:pPr>
         <w:tabs>
           <w:tab w:val="num" w:pos="0"/>
         </w:tabs>
-        <w:ind w:start="0" w:hanging="0"/>
+        <w:ind w:left="0" w:hanging="0"/>
       </w:pPr>
     </w:lvl>
     <w:lvl w:ilvl="8">
@@ -4485,12 +4474,12 @@
       <w:numFmt w:val="none"/>
       <w:suff w:val="nothing"/>
       <w:lvlText w:val=""/>
-      <w:lvlJc w:val="start"/>
+      <w:lvlJc w:val="left"/>
       <w:pPr>
         <w:tabs>
           <w:tab w:val="num" w:pos="0"/>
         </w:tabs>
-        <w:ind w:start="0" w:hanging="0"/>
+        <w:ind w:left="0" w:hanging="0"/>
       </w:pPr>
     </w:lvl>
   </w:abstractNum>
@@ -4533,7 +4522,7 @@
       <w:overflowPunct w:val="false"/>
       <w:bidi w:val="0"/>
       <w:spacing w:lineRule="auto" w:line="240" w:before="0" w:after="0"/>
-      <w:jc w:val="start"/>
+      <w:jc w:val="left"/>
     </w:pPr>
     <w:rPr>
       <w:rFonts w:ascii="Calibri" w:hAnsi="Calibri" w:eastAsia="Calibri" w:cs="Calibri"/>
@@ -5093,7 +5082,7 @@
     <w:qFormat/>
     <w:pPr>
       <w:spacing w:before="0" w:after="0"/>
-      <w:ind w:start="720"/>
+      <w:ind w:left="720"/>
       <w:contextualSpacing/>
     </w:pPr>
     <w:rPr/>
@@ -5110,7 +5099,7 @@
         <w:bottom w:val="single" w:sz="4" w:space="10" w:color="2F5496"/>
       </w:pBdr>
       <w:spacing w:before="360" w:after="360"/>
-      <w:ind w:start="864" w:end="864"/>
+      <w:ind w:left="864" w:right="864"/>
       <w:jc w:val="center"/>
     </w:pPr>
     <w:rPr>
@@ -5125,7 +5114,7 @@
     <w:qFormat/>
     <w:pPr>
       <w:spacing w:before="5" w:after="0"/>
-      <w:ind w:start="107"/>
+      <w:ind w:left="107"/>
     </w:pPr>
     <w:rPr/>
   </w:style>

</xml_diff>

<commit_message>
adding the conclusion bar
</commit_message>
<xml_diff>
--- a/template.docx
+++ b/template.docx
@@ -265,7 +265,7 @@
         <w:pStyle w:val="Normal"/>
         <w:widowControl w:val="false"/>
         <w:suppressAutoHyphens w:val="true"/>
-        <w:overflowPunct w:val="false"/>
+        <w:overflowPunct w:val="true"/>
         <w:bidi w:val="0"/>
         <w:spacing w:lineRule="auto" w:line="72" w:before="0" w:after="0"/>
         <w:ind w:hanging="0" w:left="340" w:right="-340"/>
@@ -370,9 +370,9 @@
                           <a:avLst/>
                           <a:gdLst>
                             <a:gd name="textAreaLeft" fmla="*/ 0 w 3481920"/>
-                            <a:gd name="textAreaRight" fmla="*/ 3490560 w 3481920"/>
+                            <a:gd name="textAreaRight" fmla="*/ 3490920 w 3481920"/>
                             <a:gd name="textAreaTop" fmla="*/ 0 h 720"/>
-                            <a:gd name="textAreaBottom" fmla="*/ 9831600 h 720"/>
+                            <a:gd name="textAreaBottom" fmla="*/ 14747400 h 720"/>
                           </a:gdLst>
                           <a:ahLst/>
                           <a:rect l="textAreaLeft" t="textAreaTop" r="textAreaRight" b="textAreaBottom"/>
@@ -2166,6 +2166,7 @@
                 <w:sz w:val="20"/>
                 <w:szCs w:val="20"/>
               </w:rPr>
+              <w:t>{{ team.conclusion }}</w:t>
             </w:r>
           </w:p>
         </w:tc>
@@ -4519,7 +4520,7 @@
     <w:pPr>
       <w:widowControl w:val="false"/>
       <w:suppressAutoHyphens w:val="true"/>
-      <w:overflowPunct w:val="false"/>
+      <w:overflowPunct w:val="true"/>
       <w:bidi w:val="0"/>
       <w:spacing w:lineRule="auto" w:line="240" w:before="0" w:after="0"/>
       <w:jc w:val="left"/>

</xml_diff>

<commit_message>
adding event image pages
</commit_message>
<xml_diff>
--- a/template.docx
+++ b/template.docx
@@ -265,7 +265,7 @@
         <w:pStyle w:val="Normal"/>
         <w:widowControl w:val="false"/>
         <w:suppressAutoHyphens w:val="true"/>
-        <w:overflowPunct w:val="true"/>
+        <w:overflowPunct w:val="false"/>
         <w:bidi w:val="0"/>
         <w:spacing w:lineRule="auto" w:line="72" w:before="0" w:after="0"/>
         <w:ind w:hanging="0" w:left="340" w:right="-340"/>
@@ -370,9 +370,9 @@
                           <a:avLst/>
                           <a:gdLst>
                             <a:gd name="textAreaLeft" fmla="*/ 0 w 3481920"/>
-                            <a:gd name="textAreaRight" fmla="*/ 3490920 w 3481920"/>
+                            <a:gd name="textAreaRight" fmla="*/ 3492000 w 3481920"/>
                             <a:gd name="textAreaTop" fmla="*/ 0 h 720"/>
-                            <a:gd name="textAreaBottom" fmla="*/ 14747400 h 720"/>
+                            <a:gd name="textAreaBottom" fmla="*/ 49771800 h 720"/>
                           </a:gdLst>
                           <a:ahLst/>
                           <a:rect l="textAreaLeft" t="textAreaTop" r="textAreaRight" b="textAreaBottom"/>
@@ -2289,9 +2289,9 @@
     </w:p>
     <w:tbl>
       <w:tblPr>
-        <w:tblW w:w="9359" w:type="dxa"/>
+        <w:tblW w:w="10205" w:type="dxa"/>
         <w:jc w:val="left"/>
-        <w:tblInd w:w="365" w:type="dxa"/>
+        <w:tblInd w:w="5" w:type="dxa"/>
         <w:tblLayout w:type="fixed"/>
         <w:tblCellMar>
           <w:top w:w="0" w:type="dxa"/>
@@ -2301,9 +2301,9 @@
         </w:tblCellMar>
       </w:tblPr>
       <w:tblGrid>
-        <w:gridCol w:w="3212"/>
-        <w:gridCol w:w="3139"/>
-        <w:gridCol w:w="3008"/>
+        <w:gridCol w:w="3404"/>
+        <w:gridCol w:w="3398"/>
+        <w:gridCol w:w="3403"/>
       </w:tblGrid>
       <w:tr>
         <w:trPr>
@@ -2311,7 +2311,7 @@
         </w:trPr>
         <w:tc>
           <w:tcPr>
-            <w:tcW w:w="3212" w:type="dxa"/>
+            <w:tcW w:w="3404" w:type="dxa"/>
             <w:tcBorders>
               <w:top w:val="single" w:sz="4" w:space="0" w:color="000000"/>
               <w:left w:val="single" w:sz="4" w:space="0" w:color="000000"/>
@@ -2355,7 +2355,7 @@
         </w:tc>
         <w:tc>
           <w:tcPr>
-            <w:tcW w:w="3139" w:type="dxa"/>
+            <w:tcW w:w="3398" w:type="dxa"/>
             <w:tcBorders>
               <w:top w:val="single" w:sz="4" w:space="0" w:color="000000"/>
               <w:left w:val="single" w:sz="4" w:space="0" w:color="000000"/>
@@ -2381,7 +2381,7 @@
         </w:tc>
         <w:tc>
           <w:tcPr>
-            <w:tcW w:w="3008" w:type="dxa"/>
+            <w:tcW w:w="3403" w:type="dxa"/>
             <w:tcBorders>
               <w:top w:val="single" w:sz="4" w:space="0" w:color="000000"/>
               <w:left w:val="single" w:sz="4" w:space="0" w:color="000000"/>
@@ -2412,7 +2412,7 @@
         </w:trPr>
         <w:tc>
           <w:tcPr>
-            <w:tcW w:w="3212" w:type="dxa"/>
+            <w:tcW w:w="3404" w:type="dxa"/>
             <w:tcBorders>
               <w:top w:val="single" w:sz="4" w:space="0" w:color="000000"/>
               <w:left w:val="single" w:sz="4" w:space="0" w:color="000000"/>
@@ -2435,12 +2435,13 @@
                 <w:rFonts w:ascii="Georgia" w:hAnsi="Georgia"/>
                 <w:sz w:val="20"/>
               </w:rPr>
-            </w:r>
-          </w:p>
-        </w:tc>
-        <w:tc>
-          <w:tcPr>
-            <w:tcW w:w="3139" w:type="dxa"/>
+              <w:t>{{ image1 }}</w:t>
+            </w:r>
+          </w:p>
+        </w:tc>
+        <w:tc>
+          <w:tcPr>
+            <w:tcW w:w="3398" w:type="dxa"/>
             <w:tcBorders>
               <w:top w:val="single" w:sz="4" w:space="0" w:color="000000"/>
               <w:left w:val="single" w:sz="4" w:space="0" w:color="000000"/>
@@ -2452,21 +2453,24 @@
             <w:pPr>
               <w:pStyle w:val="TableParagraph"/>
               <w:spacing w:before="0" w:after="0"/>
-              <w:ind w:left="0"/>
-              <w:rPr>
-                <w:rFonts w:ascii="Times New Roman" w:hAnsi="Times New Roman"/>
-              </w:rPr>
-            </w:pPr>
-            <w:r>
-              <w:rPr>
-                <w:rFonts w:ascii="Times New Roman" w:hAnsi="Times New Roman"/>
-              </w:rPr>
-            </w:r>
-          </w:p>
-        </w:tc>
-        <w:tc>
-          <w:tcPr>
-            <w:tcW w:w="3008" w:type="dxa"/>
+              <w:ind w:left="97"/>
+              <w:rPr>
+                <w:rFonts w:ascii="Georgia" w:hAnsi="Georgia"/>
+                <w:sz w:val="20"/>
+              </w:rPr>
+            </w:pPr>
+            <w:r>
+              <w:rPr>
+                <w:rFonts w:ascii="Georgia" w:hAnsi="Georgia"/>
+                <w:sz w:val="20"/>
+              </w:rPr>
+              <w:t>{{ image2 }}</w:t>
+            </w:r>
+          </w:p>
+        </w:tc>
+        <w:tc>
+          <w:tcPr>
+            <w:tcW w:w="3403" w:type="dxa"/>
             <w:tcBorders>
               <w:top w:val="single" w:sz="4" w:space="0" w:color="000000"/>
               <w:left w:val="single" w:sz="4" w:space="0" w:color="000000"/>
@@ -2478,15 +2482,18 @@
             <w:pPr>
               <w:pStyle w:val="TableParagraph"/>
               <w:spacing w:before="0" w:after="0"/>
-              <w:ind w:left="0"/>
-              <w:rPr>
-                <w:rFonts w:ascii="Times New Roman" w:hAnsi="Times New Roman"/>
-              </w:rPr>
-            </w:pPr>
-            <w:r>
-              <w:rPr>
-                <w:rFonts w:ascii="Times New Roman" w:hAnsi="Times New Roman"/>
-              </w:rPr>
+              <w:ind w:left="97"/>
+              <w:rPr>
+                <w:rFonts w:ascii="Georgia" w:hAnsi="Georgia"/>
+                <w:sz w:val="20"/>
+              </w:rPr>
+            </w:pPr>
+            <w:r>
+              <w:rPr>
+                <w:rFonts w:ascii="Georgia" w:hAnsi="Georgia"/>
+                <w:sz w:val="20"/>
+              </w:rPr>
+              <w:t>{{ image3 }}</w:t>
             </w:r>
           </w:p>
         </w:tc>
@@ -2497,7 +2504,7 @@
         </w:trPr>
         <w:tc>
           <w:tcPr>
-            <w:tcW w:w="3212" w:type="dxa"/>
+            <w:tcW w:w="3404" w:type="dxa"/>
             <w:tcBorders>
               <w:top w:val="single" w:sz="4" w:space="0" w:color="000000"/>
               <w:left w:val="single" w:sz="4" w:space="0" w:color="000000"/>
@@ -2541,7 +2548,7 @@
         </w:tc>
         <w:tc>
           <w:tcPr>
-            <w:tcW w:w="3139" w:type="dxa"/>
+            <w:tcW w:w="3398" w:type="dxa"/>
             <w:tcBorders>
               <w:top w:val="single" w:sz="4" w:space="0" w:color="000000"/>
               <w:left w:val="single" w:sz="4" w:space="0" w:color="000000"/>
@@ -2569,7 +2576,7 @@
         </w:tc>
         <w:tc>
           <w:tcPr>
-            <w:tcW w:w="3008" w:type="dxa"/>
+            <w:tcW w:w="3403" w:type="dxa"/>
             <w:tcBorders>
               <w:top w:val="single" w:sz="4" w:space="0" w:color="000000"/>
               <w:left w:val="single" w:sz="4" w:space="0" w:color="000000"/>
@@ -2602,7 +2609,7 @@
         </w:trPr>
         <w:tc>
           <w:tcPr>
-            <w:tcW w:w="3212" w:type="dxa"/>
+            <w:tcW w:w="3404" w:type="dxa"/>
             <w:tcBorders>
               <w:top w:val="single" w:sz="4" w:space="0" w:color="000000"/>
               <w:left w:val="single" w:sz="4" w:space="0" w:color="000000"/>
@@ -2614,23 +2621,31 @@
             <w:pPr>
               <w:pStyle w:val="TableParagraph"/>
               <w:spacing w:before="0" w:after="0"/>
-              <w:ind w:left="29"/>
-              <w:rPr>
-                <w:rFonts w:ascii="Georgia" w:hAnsi="Georgia"/>
-                <w:sz w:val="20"/>
-              </w:rPr>
-            </w:pPr>
-            <w:r>
-              <w:rPr>
-                <w:rFonts w:ascii="Georgia" w:hAnsi="Georgia"/>
-                <w:sz w:val="20"/>
-              </w:rPr>
-            </w:r>
-          </w:p>
-        </w:tc>
-        <w:tc>
-          <w:tcPr>
-            <w:tcW w:w="3139" w:type="dxa"/>
+              <w:ind w:left="97"/>
+              <w:rPr>
+                <w:rFonts w:ascii="Georgia" w:hAnsi="Georgia"/>
+                <w:sz w:val="20"/>
+              </w:rPr>
+            </w:pPr>
+            <w:r>
+              <w:rPr>
+                <w:rFonts w:ascii="Georgia" w:hAnsi="Georgia"/>
+                <w:sz w:val="20"/>
+              </w:rPr>
+              <w:t xml:space="preserve">{{ image4 </w:t>
+            </w:r>
+            <w:r>
+              <w:rPr>
+                <w:rFonts w:ascii="Georgia" w:hAnsi="Georgia"/>
+                <w:sz w:val="20"/>
+              </w:rPr>
+              <w:t>}}</w:t>
+            </w:r>
+          </w:p>
+        </w:tc>
+        <w:tc>
+          <w:tcPr>
+            <w:tcW w:w="3398" w:type="dxa"/>
             <w:tcBorders>
               <w:top w:val="single" w:sz="4" w:space="0" w:color="000000"/>
               <w:left w:val="single" w:sz="4" w:space="0" w:color="000000"/>
@@ -2642,23 +2657,24 @@
             <w:pPr>
               <w:pStyle w:val="TableParagraph"/>
               <w:spacing w:before="0" w:after="0"/>
-              <w:ind w:left="207"/>
-              <w:rPr>
-                <w:rFonts w:ascii="Georgia" w:hAnsi="Georgia"/>
-                <w:sz w:val="20"/>
-              </w:rPr>
-            </w:pPr>
-            <w:r>
-              <w:rPr>
-                <w:rFonts w:ascii="Georgia" w:hAnsi="Georgia"/>
-                <w:sz w:val="20"/>
-              </w:rPr>
-            </w:r>
-          </w:p>
-        </w:tc>
-        <w:tc>
-          <w:tcPr>
-            <w:tcW w:w="3008" w:type="dxa"/>
+              <w:ind w:left="97"/>
+              <w:rPr>
+                <w:rFonts w:ascii="Georgia" w:hAnsi="Georgia"/>
+                <w:sz w:val="20"/>
+              </w:rPr>
+            </w:pPr>
+            <w:r>
+              <w:rPr>
+                <w:rFonts w:ascii="Georgia" w:hAnsi="Georgia"/>
+                <w:sz w:val="20"/>
+              </w:rPr>
+              <w:t>{{ image5 }}</w:t>
+            </w:r>
+          </w:p>
+        </w:tc>
+        <w:tc>
+          <w:tcPr>
+            <w:tcW w:w="3403" w:type="dxa"/>
             <w:tcBorders>
               <w:top w:val="single" w:sz="4" w:space="0" w:color="000000"/>
               <w:left w:val="single" w:sz="4" w:space="0" w:color="000000"/>
@@ -2670,15 +2686,18 @@
             <w:pPr>
               <w:pStyle w:val="TableParagraph"/>
               <w:spacing w:before="0" w:after="0"/>
-              <w:ind w:left="0"/>
-              <w:rPr>
-                <w:rFonts w:ascii="Times New Roman" w:hAnsi="Times New Roman"/>
-              </w:rPr>
-            </w:pPr>
-            <w:r>
-              <w:rPr>
-                <w:rFonts w:ascii="Times New Roman" w:hAnsi="Times New Roman"/>
-              </w:rPr>
+              <w:ind w:left="97"/>
+              <w:rPr>
+                <w:rFonts w:ascii="Georgia" w:hAnsi="Georgia"/>
+                <w:sz w:val="20"/>
+              </w:rPr>
+            </w:pPr>
+            <w:r>
+              <w:rPr>
+                <w:rFonts w:ascii="Georgia" w:hAnsi="Georgia"/>
+                <w:sz w:val="20"/>
+              </w:rPr>
+              <w:t>{{ image6 }}</w:t>
             </w:r>
           </w:p>
         </w:tc>
@@ -4520,7 +4539,7 @@
     <w:pPr>
       <w:widowControl w:val="false"/>
       <w:suppressAutoHyphens w:val="true"/>
-      <w:overflowPunct w:val="true"/>
+      <w:overflowPunct w:val="false"/>
       <w:bidi w:val="0"/>
       <w:spacing w:lineRule="auto" w:line="240" w:before="0" w:after="0"/>
       <w:jc w:val="left"/>

</xml_diff>

<commit_message>
fixing half vanish of subtitle
</commit_message>
<xml_diff>
--- a/template.docx
+++ b/template.docx
@@ -240,6 +240,7 @@
       </w:r>
       <w:r>
         <w:rPr>
+          <w:rFonts w:ascii="Georgia" w:hAnsi="Georgia"/>
           <w:b/>
           <w:bCs/>
           <w:color w:val="7F7F7F"/>
@@ -250,6 +251,7 @@
       </w:r>
       <w:r>
         <w:rPr>
+          <w:rFonts w:ascii="Georgia" w:hAnsi="Georgia"/>
           <w:b/>
           <w:bCs/>
           <w:color w:val="7F7F7F"/>
@@ -257,91 +259,56 @@
           <w:sz w:val="72"/>
           <w:szCs w:val="72"/>
         </w:rPr>
-        <w:t xml:space="preserve"> HACKATHON</w:t>
+        <w:t xml:space="preserve"> HACKATHO</w:t>
+      </w:r>
+      <w:r>
+        <w:rPr>
+          <w:rFonts w:ascii="Georgia" w:hAnsi="Georgia"/>
+          <w:b/>
+          <w:bCs/>
+          <w:color w:val="7F7F7F"/>
+          <w:spacing w:val="-2"/>
+          <w:sz w:val="72"/>
+          <w:szCs w:val="72"/>
+        </w:rPr>
+        <w:t>N</w:t>
       </w:r>
     </w:p>
     <w:p>
       <w:pPr>
         <w:pStyle w:val="Normal"/>
-        <w:widowControl w:val="false"/>
-        <w:suppressAutoHyphens w:val="true"/>
-        <w:overflowPunct w:val="false"/>
-        <w:bidi w:val="0"/>
-        <w:spacing w:lineRule="auto" w:line="72" w:before="0" w:after="0"/>
-        <w:ind w:hanging="0" w:left="340" w:right="-340"/>
-        <w:jc w:val="left"/>
+        <w:spacing w:lineRule="auto" w:line="240"/>
+        <w:jc w:val="center"/>
+        <w:rPr>
+          <w:sz w:val="32"/>
+          <w:szCs w:val="32"/>
+        </w:rPr>
+      </w:pPr>
+      <w:r>
         <w:rPr>
           <w:rFonts w:ascii="Georgia" w:hAnsi="Georgia"/>
+          <w:b/>
+          <w:bCs/>
+          <w:color w:val="7F7F7F"/>
+          <w:spacing w:val="-2"/>
           <w:sz w:val="32"/>
-        </w:rPr>
-      </w:pPr>
-      <w:r>
-        <w:rPr>
-          <w:rFonts w:ascii="Georgia" w:hAnsi="Georgia"/>
-          <w:sz w:val="32"/>
-        </w:rPr>
-        <w:t>Organised</w:t>
-      </w:r>
-      <w:r>
-        <w:rPr>
-          <w:rFonts w:ascii="Georgia" w:hAnsi="Georgia"/>
-          <w:spacing w:val="-6"/>
-          <w:sz w:val="32"/>
-        </w:rPr>
-        <w:t xml:space="preserve"> </w:t>
-      </w:r>
-      <w:r>
-        <w:rPr>
-          <w:rFonts w:ascii="Georgia" w:hAnsi="Georgia"/>
-          <w:sz w:val="32"/>
-        </w:rPr>
-        <w:t>by</w:t>
-      </w:r>
-      <w:r>
-        <w:rPr>
-          <w:rFonts w:ascii="Georgia" w:hAnsi="Georgia"/>
-          <w:spacing w:val="-6"/>
-          <w:sz w:val="32"/>
-        </w:rPr>
-        <w:t xml:space="preserve"> </w:t>
-      </w:r>
-      <w:r>
-        <w:rPr>
-          <w:rFonts w:ascii="Georgia" w:hAnsi="Georgia"/>
-          <w:sz w:val="32"/>
-        </w:rPr>
-        <w:t xml:space="preserve">IdeaPad, the business Incubator of </w:t>
-      </w:r>
-      <w:r>
-        <w:rPr>
-          <w:rFonts w:ascii="Georgia" w:hAnsi="Georgia"/>
-          <w:sz w:val="32"/>
-          <w:lang w:val="en-IN" w:eastAsia="en-US" w:bidi="ar-SA"/>
-        </w:rPr>
-        <w:t xml:space="preserve">ITM </w:t>
-      </w:r>
-      <w:r>
-        <w:rPr>
-          <w:rFonts w:ascii="Georgia" w:hAnsi="Georgia"/>
-          <w:sz w:val="32"/>
-        </w:rPr>
-        <w:t>Universe</w:t>
+          <w:szCs w:val="32"/>
+        </w:rPr>
+        <w:t>Organised by IdeaPad, the business Incubator of ITM Universe</w:t>
       </w:r>
     </w:p>
     <w:p>
       <w:pPr>
-        <w:pStyle w:val="BodyText"/>
-        <w:spacing w:before="2" w:after="0"/>
-        <w:rPr>
-          <w:b w:val="false"/>
-          <w:sz w:val="8"/>
-        </w:rPr>
-      </w:pPr>
-      <w:r>
-        <w:rPr>
-          <w:b w:val="false"/>
-          <w:sz w:val="8"/>
-        </w:rPr>
+        <w:pStyle w:val="Normal"/>
+        <w:spacing w:before="296" w:after="0"/>
+        <w:ind w:left="360"/>
+        <w:rPr>
+          <w:rFonts w:ascii="Georgia" w:hAnsi="Georgia"/>
+          <w:b/>
+          <w:sz w:val="36"/>
+        </w:rPr>
+      </w:pPr>
+      <w:r>
         <mc:AlternateContent>
           <mc:Choice Requires="wps">
             <w:drawing>
@@ -370,9 +337,9 @@
                           <a:avLst/>
                           <a:gdLst>
                             <a:gd name="textAreaLeft" fmla="*/ 0 w 3481920"/>
-                            <a:gd name="textAreaRight" fmla="*/ 3492000 w 3481920"/>
+                            <a:gd name="textAreaRight" fmla="*/ 3492720 w 3481920"/>
                             <a:gd name="textAreaTop" fmla="*/ 0 h 720"/>
-                            <a:gd name="textAreaBottom" fmla="*/ 49771800 h 720"/>
+                            <a:gd name="textAreaBottom" fmla="*/ 111986280 h 720"/>
                           </a:gdLst>
                           <a:ahLst/>
                           <a:rect l="textAreaLeft" t="textAreaTop" r="textAreaRight" b="textAreaBottom"/>
@@ -413,18 +380,6 @@
           </mc:Fallback>
         </mc:AlternateContent>
       </w:r>
-    </w:p>
-    <w:p>
-      <w:pPr>
-        <w:pStyle w:val="Normal"/>
-        <w:spacing w:before="296" w:after="0"/>
-        <w:ind w:left="360"/>
-        <w:rPr>
-          <w:rFonts w:ascii="Georgia" w:hAnsi="Georgia"/>
-          <w:b/>
-          <w:sz w:val="36"/>
-        </w:rPr>
-      </w:pPr>
       <w:r>
         <w:rPr>
           <w:rFonts w:ascii="Georgia" w:hAnsi="Georgia"/>
@@ -2302,8 +2257,8 @@
       </w:tblPr>
       <w:tblGrid>
         <w:gridCol w:w="3404"/>
-        <w:gridCol w:w="3398"/>
-        <w:gridCol w:w="3403"/>
+        <w:gridCol w:w="3396"/>
+        <w:gridCol w:w="3405"/>
       </w:tblGrid>
       <w:tr>
         <w:trPr>
@@ -2355,7 +2310,7 @@
         </w:tc>
         <w:tc>
           <w:tcPr>
-            <w:tcW w:w="3398" w:type="dxa"/>
+            <w:tcW w:w="3396" w:type="dxa"/>
             <w:tcBorders>
               <w:top w:val="single" w:sz="4" w:space="0" w:color="000000"/>
               <w:left w:val="single" w:sz="4" w:space="0" w:color="000000"/>
@@ -2381,7 +2336,7 @@
         </w:tc>
         <w:tc>
           <w:tcPr>
-            <w:tcW w:w="3403" w:type="dxa"/>
+            <w:tcW w:w="3405" w:type="dxa"/>
             <w:tcBorders>
               <w:top w:val="single" w:sz="4" w:space="0" w:color="000000"/>
               <w:left w:val="single" w:sz="4" w:space="0" w:color="000000"/>
@@ -2441,7 +2396,7 @@
         </w:tc>
         <w:tc>
           <w:tcPr>
-            <w:tcW w:w="3398" w:type="dxa"/>
+            <w:tcW w:w="3396" w:type="dxa"/>
             <w:tcBorders>
               <w:top w:val="single" w:sz="4" w:space="0" w:color="000000"/>
               <w:left w:val="single" w:sz="4" w:space="0" w:color="000000"/>
@@ -2470,7 +2425,7 @@
         </w:tc>
         <w:tc>
           <w:tcPr>
-            <w:tcW w:w="3403" w:type="dxa"/>
+            <w:tcW w:w="3405" w:type="dxa"/>
             <w:tcBorders>
               <w:top w:val="single" w:sz="4" w:space="0" w:color="000000"/>
               <w:left w:val="single" w:sz="4" w:space="0" w:color="000000"/>
@@ -2548,7 +2503,7 @@
         </w:tc>
         <w:tc>
           <w:tcPr>
-            <w:tcW w:w="3398" w:type="dxa"/>
+            <w:tcW w:w="3396" w:type="dxa"/>
             <w:tcBorders>
               <w:top w:val="single" w:sz="4" w:space="0" w:color="000000"/>
               <w:left w:val="single" w:sz="4" w:space="0" w:color="000000"/>
@@ -2576,7 +2531,7 @@
         </w:tc>
         <w:tc>
           <w:tcPr>
-            <w:tcW w:w="3403" w:type="dxa"/>
+            <w:tcW w:w="3405" w:type="dxa"/>
             <w:tcBorders>
               <w:top w:val="single" w:sz="4" w:space="0" w:color="000000"/>
               <w:left w:val="single" w:sz="4" w:space="0" w:color="000000"/>
@@ -2632,20 +2587,13 @@
                 <w:rFonts w:ascii="Georgia" w:hAnsi="Georgia"/>
                 <w:sz w:val="20"/>
               </w:rPr>
-              <w:t xml:space="preserve">{{ image4 </w:t>
-            </w:r>
-            <w:r>
-              <w:rPr>
-                <w:rFonts w:ascii="Georgia" w:hAnsi="Georgia"/>
-                <w:sz w:val="20"/>
-              </w:rPr>
-              <w:t>}}</w:t>
-            </w:r>
-          </w:p>
-        </w:tc>
-        <w:tc>
-          <w:tcPr>
-            <w:tcW w:w="3398" w:type="dxa"/>
+              <w:t>{{ image4 }}</w:t>
+            </w:r>
+          </w:p>
+        </w:tc>
+        <w:tc>
+          <w:tcPr>
+            <w:tcW w:w="3396" w:type="dxa"/>
             <w:tcBorders>
               <w:top w:val="single" w:sz="4" w:space="0" w:color="000000"/>
               <w:left w:val="single" w:sz="4" w:space="0" w:color="000000"/>
@@ -2674,7 +2622,7 @@
         </w:tc>
         <w:tc>
           <w:tcPr>
-            <w:tcW w:w="3403" w:type="dxa"/>
+            <w:tcW w:w="3405" w:type="dxa"/>
             <w:tcBorders>
               <w:top w:val="single" w:sz="4" w:space="0" w:color="000000"/>
               <w:left w:val="single" w:sz="4" w:space="0" w:color="000000"/>

</xml_diff>

<commit_message>
fixing event image layout
</commit_message>
<xml_diff>
--- a/template.docx
+++ b/template.docx
@@ -2256,9 +2256,8 @@
         </w:tblCellMar>
       </w:tblPr>
       <w:tblGrid>
-        <w:gridCol w:w="3404"/>
-        <w:gridCol w:w="3396"/>
-        <w:gridCol w:w="3405"/>
+        <w:gridCol w:w="5102"/>
+        <w:gridCol w:w="5103"/>
       </w:tblGrid>
       <w:tr>
         <w:trPr>
@@ -2266,7 +2265,7 @@
         </w:trPr>
         <w:tc>
           <w:tcPr>
-            <w:tcW w:w="3404" w:type="dxa"/>
+            <w:tcW w:w="5102" w:type="dxa"/>
             <w:tcBorders>
               <w:top w:val="single" w:sz="4" w:space="0" w:color="000000"/>
               <w:left w:val="single" w:sz="4" w:space="0" w:color="000000"/>
@@ -2310,33 +2309,7 @@
         </w:tc>
         <w:tc>
           <w:tcPr>
-            <w:tcW w:w="3396" w:type="dxa"/>
-            <w:tcBorders>
-              <w:top w:val="single" w:sz="4" w:space="0" w:color="000000"/>
-              <w:left w:val="single" w:sz="4" w:space="0" w:color="000000"/>
-              <w:bottom w:val="single" w:sz="4" w:space="0" w:color="000000"/>
-              <w:right w:val="single" w:sz="4" w:space="0" w:color="000000"/>
-            </w:tcBorders>
-          </w:tcPr>
-          <w:p>
-            <w:pPr>
-              <w:pStyle w:val="TableParagraph"/>
-              <w:spacing w:before="0" w:after="0"/>
-              <w:ind w:left="0"/>
-              <w:rPr>
-                <w:rFonts w:ascii="Times New Roman" w:hAnsi="Times New Roman"/>
-              </w:rPr>
-            </w:pPr>
-            <w:r>
-              <w:rPr>
-                <w:rFonts w:ascii="Times New Roman" w:hAnsi="Times New Roman"/>
-              </w:rPr>
-            </w:r>
-          </w:p>
-        </w:tc>
-        <w:tc>
-          <w:tcPr>
-            <w:tcW w:w="3405" w:type="dxa"/>
+            <w:tcW w:w="5103" w:type="dxa"/>
             <w:tcBorders>
               <w:top w:val="single" w:sz="4" w:space="0" w:color="000000"/>
               <w:left w:val="single" w:sz="4" w:space="0" w:color="000000"/>
@@ -2367,7 +2340,7 @@
         </w:trPr>
         <w:tc>
           <w:tcPr>
-            <w:tcW w:w="3404" w:type="dxa"/>
+            <w:tcW w:w="5102" w:type="dxa"/>
             <w:tcBorders>
               <w:top w:val="single" w:sz="4" w:space="0" w:color="000000"/>
               <w:left w:val="single" w:sz="4" w:space="0" w:color="000000"/>
@@ -2396,7 +2369,7 @@
         </w:tc>
         <w:tc>
           <w:tcPr>
-            <w:tcW w:w="3396" w:type="dxa"/>
+            <w:tcW w:w="5103" w:type="dxa"/>
             <w:tcBorders>
               <w:top w:val="single" w:sz="4" w:space="0" w:color="000000"/>
               <w:left w:val="single" w:sz="4" w:space="0" w:color="000000"/>
@@ -2420,35 +2393,6 @@
                 <w:sz w:val="20"/>
               </w:rPr>
               <w:t>{{ image2 }}</w:t>
-            </w:r>
-          </w:p>
-        </w:tc>
-        <w:tc>
-          <w:tcPr>
-            <w:tcW w:w="3405" w:type="dxa"/>
-            <w:tcBorders>
-              <w:top w:val="single" w:sz="4" w:space="0" w:color="000000"/>
-              <w:left w:val="single" w:sz="4" w:space="0" w:color="000000"/>
-              <w:bottom w:val="single" w:sz="4" w:space="0" w:color="000000"/>
-              <w:right w:val="single" w:sz="4" w:space="0" w:color="000000"/>
-            </w:tcBorders>
-          </w:tcPr>
-          <w:p>
-            <w:pPr>
-              <w:pStyle w:val="TableParagraph"/>
-              <w:spacing w:before="0" w:after="0"/>
-              <w:ind w:left="97"/>
-              <w:rPr>
-                <w:rFonts w:ascii="Georgia" w:hAnsi="Georgia"/>
-                <w:sz w:val="20"/>
-              </w:rPr>
-            </w:pPr>
-            <w:r>
-              <w:rPr>
-                <w:rFonts w:ascii="Georgia" w:hAnsi="Georgia"/>
-                <w:sz w:val="20"/>
-              </w:rPr>
-              <w:t>{{ image3 }}</w:t>
             </w:r>
           </w:p>
         </w:tc>
@@ -2459,7 +2403,7 @@
         </w:trPr>
         <w:tc>
           <w:tcPr>
-            <w:tcW w:w="3404" w:type="dxa"/>
+            <w:tcW w:w="5102" w:type="dxa"/>
             <w:tcBorders>
               <w:top w:val="single" w:sz="4" w:space="0" w:color="000000"/>
               <w:left w:val="single" w:sz="4" w:space="0" w:color="000000"/>
@@ -2503,35 +2447,7 @@
         </w:tc>
         <w:tc>
           <w:tcPr>
-            <w:tcW w:w="3396" w:type="dxa"/>
-            <w:tcBorders>
-              <w:top w:val="single" w:sz="4" w:space="0" w:color="000000"/>
-              <w:left w:val="single" w:sz="4" w:space="0" w:color="000000"/>
-              <w:bottom w:val="single" w:sz="4" w:space="0" w:color="000000"/>
-              <w:right w:val="single" w:sz="4" w:space="0" w:color="000000"/>
-            </w:tcBorders>
-          </w:tcPr>
-          <w:p>
-            <w:pPr>
-              <w:pStyle w:val="TableParagraph"/>
-              <w:spacing w:before="0" w:after="0"/>
-              <w:ind w:left="0"/>
-              <w:rPr>
-                <w:rFonts w:ascii="Times New Roman" w:hAnsi="Times New Roman"/>
-                <w:sz w:val="20"/>
-              </w:rPr>
-            </w:pPr>
-            <w:r>
-              <w:rPr>
-                <w:rFonts w:ascii="Times New Roman" w:hAnsi="Times New Roman"/>
-                <w:sz w:val="20"/>
-              </w:rPr>
-            </w:r>
-          </w:p>
-        </w:tc>
-        <w:tc>
-          <w:tcPr>
-            <w:tcW w:w="3405" w:type="dxa"/>
+            <w:tcW w:w="5103" w:type="dxa"/>
             <w:tcBorders>
               <w:top w:val="single" w:sz="4" w:space="0" w:color="000000"/>
               <w:left w:val="single" w:sz="4" w:space="0" w:color="000000"/>
@@ -2564,7 +2480,7 @@
         </w:trPr>
         <w:tc>
           <w:tcPr>
-            <w:tcW w:w="3404" w:type="dxa"/>
+            <w:tcW w:w="5102" w:type="dxa"/>
             <w:tcBorders>
               <w:top w:val="single" w:sz="4" w:space="0" w:color="000000"/>
               <w:left w:val="single" w:sz="4" w:space="0" w:color="000000"/>
@@ -2593,7 +2509,7 @@
         </w:tc>
         <w:tc>
           <w:tcPr>
-            <w:tcW w:w="3396" w:type="dxa"/>
+            <w:tcW w:w="5103" w:type="dxa"/>
             <w:tcBorders>
               <w:top w:val="single" w:sz="4" w:space="0" w:color="000000"/>
               <w:left w:val="single" w:sz="4" w:space="0" w:color="000000"/>
@@ -2616,36 +2532,7 @@
                 <w:rFonts w:ascii="Georgia" w:hAnsi="Georgia"/>
                 <w:sz w:val="20"/>
               </w:rPr>
-              <w:t>{{ image5 }}</w:t>
-            </w:r>
-          </w:p>
-        </w:tc>
-        <w:tc>
-          <w:tcPr>
-            <w:tcW w:w="3405" w:type="dxa"/>
-            <w:tcBorders>
-              <w:top w:val="single" w:sz="4" w:space="0" w:color="000000"/>
-              <w:left w:val="single" w:sz="4" w:space="0" w:color="000000"/>
-              <w:bottom w:val="single" w:sz="4" w:space="0" w:color="000000"/>
-              <w:right w:val="single" w:sz="4" w:space="0" w:color="000000"/>
-            </w:tcBorders>
-          </w:tcPr>
-          <w:p>
-            <w:pPr>
-              <w:pStyle w:val="TableParagraph"/>
-              <w:spacing w:before="0" w:after="0"/>
-              <w:ind w:left="97"/>
-              <w:rPr>
-                <w:rFonts w:ascii="Georgia" w:hAnsi="Georgia"/>
-                <w:sz w:val="20"/>
-              </w:rPr>
-            </w:pPr>
-            <w:r>
-              <w:rPr>
-                <w:rFonts w:ascii="Georgia" w:hAnsi="Georgia"/>
-                <w:sz w:val="20"/>
-              </w:rPr>
-              <w:t>{{ image6 }}</w:t>
+              <w:t>{{ image3 }}</w:t>
             </w:r>
           </w:p>
         </w:tc>

</xml_diff>